<commit_message>
final brainstorm logs/features pre-PRD
</commit_message>
<xml_diff>
--- a/docs/Brainstorm_Features.docx
+++ b/docs/Brainstorm_Features.docx
@@ -20,21 +20,7 @@
         <w:rPr>
           <w:rFonts w:ascii="Calibri" w:eastAsia="Times New Roman" w:hAnsi="Calibri" w:cs="Calibri"/>
         </w:rPr>
-        <w:t xml:space="preserve">: Many apps and websites are designed to capture and retain your attention, and this can lead to severe phone and internet addiction, drive negative procrastination behavioral feedback loops, and ruin work habits. This is particularly harmful for remote workers and neurodiverse individuals, such as those with ADHD. </w:t>
-      </w:r>
-      <w:proofErr w:type="gramStart"/>
-      <w:r>
-        <w:rPr>
-          <w:rFonts w:ascii="Calibri" w:eastAsia="Times New Roman" w:hAnsi="Calibri" w:cs="Calibri"/>
-        </w:rPr>
-        <w:t>A vast</w:t>
-      </w:r>
-      <w:proofErr w:type="gramEnd"/>
-      <w:r>
-        <w:rPr>
-          <w:rFonts w:ascii="Calibri" w:eastAsia="Times New Roman" w:hAnsi="Calibri" w:cs="Calibri"/>
-        </w:rPr>
-        <w:t xml:space="preserve"> majority of Gen Z will admit that they spend far too much time on their phone or computer unproductively, and they hate that they are doing it, but they can't help it. There are services that exist to block apps or websites, but these don't tackle the root issues of internet addiction. Other services exist to help track tasks/goals, or help with time management, but most of these are passive apps that aren't actively reviewing what you are doing and assisting you along the way. </w:t>
+        <w:t xml:space="preserve">: Many apps and websites are designed to capture and retain your attention, and this can lead to severe phone and internet addiction, drive negative procrastination behavioral feedback loops, and ruin work habits. This is particularly harmful for remote workers and neurodiverse individuals, such as those with ADHD. A vast majority of Gen Z will admit that they spend far too much time on their phone or computer unproductively, and they hate that they are doing it, but they can't help it. There are services that exist to block apps or websites, but these don't tackle the root issues of internet addiction. Other services exist to help track tasks/goals, or help with time management, but most of these are passive apps that aren't actively reviewing what you are doing and assisting you along the way. </w:t>
       </w:r>
     </w:p>
     <w:p>
@@ -94,35 +80,7 @@
         <w:rPr>
           <w:rFonts w:ascii="Calibri" w:eastAsia="Times New Roman" w:hAnsi="Calibri" w:cs="Calibri"/>
         </w:rPr>
-        <w:t xml:space="preserve">: An empathy-oriented productivity app called "Momentum" that monitors my time spent on specific apps or websites and prompts me with CBT Thought Records to force me to analyze and create logs for why I am procrastinating. Based on my response, it will give me advice </w:t>
-      </w:r>
-      <w:proofErr w:type="gramStart"/>
-      <w:r>
-        <w:rPr>
-          <w:rFonts w:ascii="Calibri" w:eastAsia="Times New Roman" w:hAnsi="Calibri" w:cs="Calibri"/>
-        </w:rPr>
-        <w:t>for</w:t>
-      </w:r>
-      <w:proofErr w:type="gramEnd"/>
-      <w:r>
-        <w:rPr>
-          <w:rFonts w:ascii="Calibri" w:eastAsia="Times New Roman" w:hAnsi="Calibri" w:cs="Calibri"/>
-        </w:rPr>
-        <w:t xml:space="preserve"> how to stop avoiding what I am doing and how I can get started with actionable steps. It will give me tips to achieve longer, sustained focus, and will hold me accountable to them. Finally, it will help with organizing weekly tasks, daily task breakdown, and </w:t>
-      </w:r>
-      <w:proofErr w:type="gramStart"/>
-      <w:r>
-        <w:rPr>
-          <w:rFonts w:ascii="Calibri" w:eastAsia="Times New Roman" w:hAnsi="Calibri" w:cs="Calibri"/>
-        </w:rPr>
-        <w:t>long term</w:t>
-      </w:r>
-      <w:proofErr w:type="gramEnd"/>
-      <w:r>
-        <w:rPr>
-          <w:rFonts w:ascii="Calibri" w:eastAsia="Times New Roman" w:hAnsi="Calibri" w:cs="Calibri"/>
-        </w:rPr>
-        <w:t xml:space="preserve"> goal tracking.</w:t>
+        <w:t>: An empathy-oriented productivity app called "Momentum" that monitors my time spent on specific apps or websites and prompts me with CBT Thought Records to force me to analyze and create logs for why I am procrastinating. Based on my response, it will give me advice for how to stop avoiding what I am doing and how I can get started with actionable steps. It will give me tips to achieve longer, sustained focus, and will hold me accountable to them. Finally, it will help with organizing weekly tasks, daily task breakdown, and long term goal tracking.</w:t>
       </w:r>
     </w:p>
     <w:p>
@@ -157,7 +115,7 @@
       <w:pPr>
         <w:numPr>
           <w:ilvl w:val="0"/>
-          <w:numId w:val="15"/>
+          <w:numId w:val="20"/>
         </w:numPr>
         <w:textAlignment w:val="center"/>
         <w:rPr>
@@ -183,7 +141,7 @@
       <w:pPr>
         <w:numPr>
           <w:ilvl w:val="0"/>
-          <w:numId w:val="15"/>
+          <w:numId w:val="20"/>
         </w:numPr>
         <w:textAlignment w:val="center"/>
         <w:rPr>
@@ -202,28 +160,14 @@
         <w:rPr>
           <w:rFonts w:ascii="Calibri" w:eastAsia="Times New Roman" w:hAnsi="Calibri" w:cs="Calibri"/>
         </w:rPr>
-        <w:t xml:space="preserve">: This page prompts you to input all the tasks you need to complete this week. It forces you to consider what is only necessary for this week and allows you the option to push unessential items to next week's list. The app saves the list for each week in the current week of the Calendar page. Upon completion of the weekly tasks, the user can press the "Select Today's Tasks" button that allows users to choose which items from the weekly list they want to add to the Daily Task list. Once the user has finished </w:t>
-      </w:r>
-      <w:proofErr w:type="gramStart"/>
-      <w:r>
-        <w:rPr>
-          <w:rFonts w:ascii="Calibri" w:eastAsia="Times New Roman" w:hAnsi="Calibri" w:cs="Calibri"/>
-        </w:rPr>
-        <w:t>adding</w:t>
-      </w:r>
-      <w:proofErr w:type="gramEnd"/>
-      <w:r>
-        <w:rPr>
-          <w:rFonts w:ascii="Calibri" w:eastAsia="Times New Roman" w:hAnsi="Calibri" w:cs="Calibri"/>
-        </w:rPr>
-        <w:t xml:space="preserve"> to the daily list, the app will switch from the Weekly Task page to the Daily Task page.</w:t>
+        <w:t>: This page prompts you to input all the tasks you need to complete this week. It forces you to consider what is only necessary for this week and allows you the option to push unessential items to next week's list. The app saves the list for each week in the current week of the Calendar page. Upon completion of the weekly tasks, the user can press the "Select Today's Tasks" button that allows users to choose which items from the weekly list they want to add to the Daily Task list. Once the user has finished adding to the daily list, the app will switch from the Weekly Task page to the Daily Task page.</w:t>
       </w:r>
     </w:p>
     <w:p>
       <w:pPr>
         <w:numPr>
           <w:ilvl w:val="0"/>
-          <w:numId w:val="15"/>
+          <w:numId w:val="20"/>
         </w:numPr>
         <w:textAlignment w:val="center"/>
         <w:rPr>
@@ -249,7 +193,7 @@
       <w:pPr>
         <w:numPr>
           <w:ilvl w:val="0"/>
-          <w:numId w:val="15"/>
+          <w:numId w:val="20"/>
         </w:numPr>
         <w:textAlignment w:val="center"/>
         <w:rPr>
@@ -269,42 +213,14 @@
         <w:rPr>
           <w:rFonts w:ascii="Calibri" w:eastAsia="Times New Roman" w:hAnsi="Calibri" w:cs="Calibri"/>
         </w:rPr>
-        <w:t xml:space="preserve">: The calendar is viewable by day or </w:t>
-      </w:r>
-      <w:proofErr w:type="gramStart"/>
-      <w:r>
-        <w:rPr>
-          <w:rFonts w:ascii="Calibri" w:eastAsia="Times New Roman" w:hAnsi="Calibri" w:cs="Calibri"/>
-        </w:rPr>
-        <w:t>week, and</w:t>
-      </w:r>
-      <w:proofErr w:type="gramEnd"/>
-      <w:r>
-        <w:rPr>
-          <w:rFonts w:ascii="Calibri" w:eastAsia="Times New Roman" w:hAnsi="Calibri" w:cs="Calibri"/>
-        </w:rPr>
-        <w:t xml:space="preserve"> shows the daily or weekly tasks respectively. It saves data from previous days and weeks so users can see what they need to do this week and what they've accomplished in previous weeks. It shows </w:t>
-      </w:r>
-      <w:proofErr w:type="gramStart"/>
-      <w:r>
-        <w:rPr>
-          <w:rFonts w:ascii="Calibri" w:eastAsia="Times New Roman" w:hAnsi="Calibri" w:cs="Calibri"/>
-        </w:rPr>
-        <w:t>the next weeks</w:t>
-      </w:r>
-      <w:proofErr w:type="gramEnd"/>
-      <w:r>
-        <w:rPr>
-          <w:rFonts w:ascii="Calibri" w:eastAsia="Times New Roman" w:hAnsi="Calibri" w:cs="Calibri"/>
-        </w:rPr>
-        <w:t xml:space="preserve"> tasks that were deemed unnecessary from the current week's list. It lists goal milestones from the Goal Tracking page.</w:t>
+        <w:t>: The calendar is viewable by day or week, and shows the daily or weekly tasks respectively. It saves data from previous days and weeks so users can see what they need to do this week and what they've accomplished in previous weeks. It shows the next weeks tasks that were deemed unnecessary from the current week's list. It lists goal milestones from the Goal Tracking page.</w:t>
       </w:r>
     </w:p>
     <w:p>
       <w:pPr>
         <w:numPr>
           <w:ilvl w:val="0"/>
-          <w:numId w:val="15"/>
+          <w:numId w:val="20"/>
         </w:numPr>
         <w:textAlignment w:val="center"/>
         <w:rPr>
@@ -323,28 +239,14 @@
         <w:rPr>
           <w:rFonts w:ascii="Calibri" w:eastAsia="Times New Roman" w:hAnsi="Calibri" w:cs="Calibri"/>
         </w:rPr>
-        <w:t xml:space="preserve">: This page allows users to add or delete any websites or apps that they want or don't want to allow. This is a global </w:t>
-      </w:r>
-      <w:proofErr w:type="gramStart"/>
-      <w:r>
-        <w:rPr>
-          <w:rFonts w:ascii="Calibri" w:eastAsia="Times New Roman" w:hAnsi="Calibri" w:cs="Calibri"/>
-        </w:rPr>
-        <w:t>setting</w:t>
-      </w:r>
-      <w:proofErr w:type="gramEnd"/>
-      <w:r>
-        <w:rPr>
-          <w:rFonts w:ascii="Calibri" w:eastAsia="Times New Roman" w:hAnsi="Calibri" w:cs="Calibri"/>
-        </w:rPr>
-        <w:t xml:space="preserve"> and this list should apply to any task by default. Individual tasks have the option to overwrite this feature. Global Strict Mode setting is here, which can be overwritten by the Strict Mode setting in the task view.</w:t>
+        <w:t>: This page allows users to add or delete any websites or apps that they want or don't want to allow. This is a global setting and this list should apply to any task by default. Individual tasks have the option to overwrite this feature. Global Strict Mode setting is here, which can be overwritten by the Strict Mode setting in the task view.</w:t>
       </w:r>
     </w:p>
     <w:p>
       <w:pPr>
         <w:numPr>
           <w:ilvl w:val="0"/>
-          <w:numId w:val="15"/>
+          <w:numId w:val="20"/>
         </w:numPr>
         <w:textAlignment w:val="center"/>
         <w:rPr>
@@ -370,7 +272,7 @@
       <w:pPr>
         <w:numPr>
           <w:ilvl w:val="0"/>
-          <w:numId w:val="15"/>
+          <w:numId w:val="20"/>
         </w:numPr>
         <w:textAlignment w:val="center"/>
         <w:rPr>
@@ -389,36 +291,14 @@
         <w:rPr>
           <w:rFonts w:ascii="Calibri" w:eastAsia="Times New Roman" w:hAnsi="Calibri" w:cs="Calibri"/>
         </w:rPr>
-        <w:t xml:space="preserve">landing page to view all previous Procrastination Logs that are saved as DD/MM/YY </w:t>
-      </w:r>
-      <w:proofErr w:type="spellStart"/>
-      <w:proofErr w:type="gramStart"/>
-      <w:r>
-        <w:rPr>
-          <w:rFonts w:ascii="Calibri" w:eastAsia="Times New Roman" w:hAnsi="Calibri" w:cs="Calibri"/>
-        </w:rPr>
-        <w:t>hh:mm</w:t>
-      </w:r>
-      <w:proofErr w:type="spellEnd"/>
-      <w:r>
-        <w:rPr>
-          <w:rFonts w:ascii="Calibri" w:eastAsia="Times New Roman" w:hAnsi="Calibri" w:cs="Calibri"/>
-        </w:rPr>
-        <w:t>.</w:t>
-      </w:r>
-      <w:proofErr w:type="gramEnd"/>
-      <w:r>
-        <w:rPr>
-          <w:rFonts w:ascii="Calibri" w:eastAsia="Times New Roman" w:hAnsi="Calibri" w:cs="Calibri"/>
-        </w:rPr>
-        <w:t xml:space="preserve"> User can manually add a log here.</w:t>
+        <w:t>landing page to view all previous Procrastination Logs that are saved as DD/MM/YY hh:mm. User can manually add a log here.</w:t>
       </w:r>
     </w:p>
     <w:p>
       <w:pPr>
         <w:numPr>
           <w:ilvl w:val="0"/>
-          <w:numId w:val="15"/>
+          <w:numId w:val="20"/>
         </w:numPr>
         <w:textAlignment w:val="center"/>
         <w:rPr>
@@ -446,7 +326,7 @@
       <w:pPr>
         <w:numPr>
           <w:ilvl w:val="0"/>
-          <w:numId w:val="15"/>
+          <w:numId w:val="20"/>
         </w:numPr>
         <w:textAlignment w:val="center"/>
         <w:rPr>
@@ -465,28 +345,14 @@
         <w:rPr>
           <w:rFonts w:ascii="Calibri" w:eastAsia="Times New Roman" w:hAnsi="Calibri" w:cs="Calibri"/>
         </w:rPr>
-        <w:t xml:space="preserve">Current day, past days, and weekly/monthly trends as a bar graph with each bar the sum of the 3 data types (productive, unproductive, </w:t>
-      </w:r>
-      <w:proofErr w:type="gramStart"/>
-      <w:r>
-        <w:rPr>
-          <w:rFonts w:ascii="Calibri" w:eastAsia="Times New Roman" w:hAnsi="Calibri" w:cs="Calibri"/>
-        </w:rPr>
-        <w:t>not-sure</w:t>
-      </w:r>
-      <w:proofErr w:type="gramEnd"/>
-      <w:r>
-        <w:rPr>
-          <w:rFonts w:ascii="Calibri" w:eastAsia="Times New Roman" w:hAnsi="Calibri" w:cs="Calibri"/>
-        </w:rPr>
-        <w:t xml:space="preserve">). </w:t>
+        <w:t xml:space="preserve">Current day, past days, and weekly/monthly trends as a bar graph with each bar the sum of the 3 data types (productive, unproductive, not-sure). </w:t>
       </w:r>
     </w:p>
     <w:p>
       <w:pPr>
         <w:numPr>
           <w:ilvl w:val="0"/>
-          <w:numId w:val="15"/>
+          <w:numId w:val="20"/>
         </w:numPr>
         <w:textAlignment w:val="center"/>
         <w:rPr>
@@ -505,42 +371,14 @@
         <w:rPr>
           <w:rFonts w:ascii="Calibri" w:eastAsia="Times New Roman" w:hAnsi="Calibri" w:cs="Calibri"/>
         </w:rPr>
-        <w:t xml:space="preserve"> Shows total minutes productive vs unproductive vs </w:t>
-      </w:r>
-      <w:proofErr w:type="gramStart"/>
-      <w:r>
-        <w:rPr>
-          <w:rFonts w:ascii="Calibri" w:eastAsia="Times New Roman" w:hAnsi="Calibri" w:cs="Calibri"/>
-        </w:rPr>
-        <w:t>not-sure</w:t>
-      </w:r>
-      <w:proofErr w:type="gramEnd"/>
-      <w:r>
-        <w:rPr>
-          <w:rFonts w:ascii="Calibri" w:eastAsia="Times New Roman" w:hAnsi="Calibri" w:cs="Calibri"/>
-        </w:rPr>
-        <w:t xml:space="preserve"> for the current live session. Ability to set a timer or Pomodoro Timer here. If Pomodoro Timer is enabled, this view shows the live timer </w:t>
-      </w:r>
-      <w:proofErr w:type="gramStart"/>
-      <w:r>
-        <w:rPr>
-          <w:rFonts w:ascii="Calibri" w:eastAsia="Times New Roman" w:hAnsi="Calibri" w:cs="Calibri"/>
-        </w:rPr>
-        <w:t>counting up</w:t>
-      </w:r>
-      <w:proofErr w:type="gramEnd"/>
-      <w:r>
-        <w:rPr>
-          <w:rFonts w:ascii="Calibri" w:eastAsia="Times New Roman" w:hAnsi="Calibri" w:cs="Calibri"/>
-        </w:rPr>
-        <w:t>.</w:t>
+        <w:t xml:space="preserve"> Shows total minutes productive vs unproductive vs not-sure for the current live session. Ability to set a timer or Pomodoro Timer here. If Pomodoro Timer is enabled, this view shows the live timer counting up.</w:t>
       </w:r>
     </w:p>
     <w:p>
       <w:pPr>
         <w:numPr>
           <w:ilvl w:val="0"/>
-          <w:numId w:val="15"/>
+          <w:numId w:val="20"/>
         </w:numPr>
         <w:textAlignment w:val="center"/>
         <w:rPr>
@@ -566,7 +404,7 @@
       <w:pPr>
         <w:numPr>
           <w:ilvl w:val="0"/>
-          <w:numId w:val="15"/>
+          <w:numId w:val="20"/>
         </w:numPr>
         <w:textAlignment w:val="center"/>
         <w:rPr>
@@ -587,7 +425,7 @@
           <w:rFonts w:ascii="Calibri" w:eastAsia="Times New Roman" w:hAnsi="Calibri" w:cs="Calibri"/>
           <w:highlight w:val="yellow"/>
         </w:rPr>
-        <w:t>: add a screenshot. Dashboard is tabled for a separate view. Current UI idea is a specific flow to decrease overwhelm/friction of using the app</w:t>
+        <w:t>: add a screenshot. Dashboard is tabled for a separate view. Current version's UI idea is a specific flow to decrease overwhelm/friction of using the app</w:t>
       </w:r>
     </w:p>
     <w:p>
@@ -623,7 +461,7 @@
       <w:pPr>
         <w:numPr>
           <w:ilvl w:val="0"/>
-          <w:numId w:val="16"/>
+          <w:numId w:val="21"/>
         </w:numPr>
         <w:textAlignment w:val="center"/>
         <w:rPr>
@@ -641,7 +479,7 @@
       <w:pPr>
         <w:numPr>
           <w:ilvl w:val="0"/>
-          <w:numId w:val="16"/>
+          <w:numId w:val="21"/>
         </w:numPr>
         <w:textAlignment w:val="center"/>
         <w:rPr>
@@ -659,7 +497,7 @@
       <w:pPr>
         <w:numPr>
           <w:ilvl w:val="0"/>
-          <w:numId w:val="16"/>
+          <w:numId w:val="21"/>
         </w:numPr>
         <w:textAlignment w:val="center"/>
         <w:rPr>
@@ -677,7 +515,7 @@
       <w:pPr>
         <w:numPr>
           <w:ilvl w:val="0"/>
-          <w:numId w:val="16"/>
+          <w:numId w:val="21"/>
         </w:numPr>
         <w:textAlignment w:val="center"/>
         <w:rPr>
@@ -695,7 +533,7 @@
       <w:pPr>
         <w:numPr>
           <w:ilvl w:val="0"/>
-          <w:numId w:val="16"/>
+          <w:numId w:val="21"/>
         </w:numPr>
         <w:textAlignment w:val="center"/>
         <w:rPr>
@@ -713,7 +551,7 @@
       <w:pPr>
         <w:numPr>
           <w:ilvl w:val="0"/>
-          <w:numId w:val="16"/>
+          <w:numId w:val="21"/>
         </w:numPr>
         <w:textAlignment w:val="center"/>
         <w:rPr>
@@ -731,7 +569,7 @@
       <w:pPr>
         <w:numPr>
           <w:ilvl w:val="0"/>
-          <w:numId w:val="16"/>
+          <w:numId w:val="21"/>
         </w:numPr>
         <w:textAlignment w:val="center"/>
         <w:rPr>
@@ -749,7 +587,7 @@
       <w:pPr>
         <w:numPr>
           <w:ilvl w:val="0"/>
-          <w:numId w:val="16"/>
+          <w:numId w:val="21"/>
         </w:numPr>
         <w:textAlignment w:val="center"/>
         <w:rPr>
@@ -768,7 +606,7 @@
       <w:pPr>
         <w:numPr>
           <w:ilvl w:val="0"/>
-          <w:numId w:val="16"/>
+          <w:numId w:val="21"/>
         </w:numPr>
         <w:textAlignment w:val="center"/>
         <w:rPr>
@@ -783,67 +621,36 @@
         </w:rPr>
         <w:t>"Feeling Distracted?" Popup page</w:t>
       </w:r>
-      <w:proofErr w:type="gramStart"/>
-      <w:r>
-        <w:rPr>
-          <w:rFonts w:ascii="Calibri" w:eastAsia="Times New Roman" w:hAnsi="Calibri" w:cs="Calibri"/>
-        </w:rPr>
-        <w:t>:  Appears</w:t>
-      </w:r>
-      <w:proofErr w:type="gramEnd"/>
-      <w:r>
-        <w:rPr>
-          <w:rFonts w:ascii="Calibri" w:eastAsia="Times New Roman" w:hAnsi="Calibri" w:cs="Calibri"/>
-        </w:rPr>
-        <w:t xml:space="preserve"> after user accumulates 2 minutes of unproductive data, or 5 minutes of not-sure data. These minimums are configurable in Settings. This forces a windows notification. The popup offers the option for the user to "View risk factors that might be amplifying my emotions or harming focus" leading to Risk Factors page, or to "Try a Procrastination Log" leading to Procrastination Logs page (not the full Procrastination Logs landing page)</w:t>
+      <w:r>
+        <w:rPr>
+          <w:rFonts w:ascii="Calibri" w:eastAsia="Times New Roman" w:hAnsi="Calibri" w:cs="Calibri"/>
+        </w:rPr>
+        <w:t>:  Appears after user accumulates 2 minutes of unproductive data, or 5 minutes of not-sure data. These minimums are configurable in Settings. This forces a windows notification. The popup offers the option for the user to "View risk factors that might be amplifying my emotions or harming focus" leading to Risk Factors page, or to "Try a Procrastination Log" leading to Procrastination Logs page (not the full Procrastination Logs landing page)</w:t>
       </w:r>
     </w:p>
     <w:p>
       <w:pPr>
         <w:numPr>
           <w:ilvl w:val="0"/>
-          <w:numId w:val="16"/>
-        </w:numPr>
-        <w:textAlignment w:val="center"/>
-        <w:rPr>
-          <w:rFonts w:ascii="Calibri" w:eastAsia="Times New Roman" w:hAnsi="Calibri" w:cs="Calibri"/>
-        </w:rPr>
-      </w:pPr>
-      <w:r>
-        <w:rPr>
-          <w:rFonts w:ascii="Calibri" w:eastAsia="Times New Roman" w:hAnsi="Calibri" w:cs="Calibri"/>
-          <w:highlight w:val="yellow"/>
-        </w:rPr>
-        <w:t xml:space="preserve">Procrastination Logs: Include a screenshot, "start a </w:t>
-      </w:r>
-      <w:proofErr w:type="gramStart"/>
-      <w:r>
-        <w:rPr>
-          <w:rFonts w:ascii="Calibri" w:eastAsia="Times New Roman" w:hAnsi="Calibri" w:cs="Calibri"/>
-          <w:highlight w:val="yellow"/>
-        </w:rPr>
-        <w:t>10 minute</w:t>
-      </w:r>
-      <w:proofErr w:type="gramEnd"/>
-      <w:r>
-        <w:rPr>
-          <w:rFonts w:ascii="Calibri" w:eastAsia="Times New Roman" w:hAnsi="Calibri" w:cs="Calibri"/>
-          <w:highlight w:val="yellow"/>
-        </w:rPr>
-        <w:t xml:space="preserve"> timer" button</w:t>
-      </w:r>
-      <w:r>
-        <w:rPr>
-          <w:rFonts w:ascii="Calibri" w:eastAsia="Times New Roman" w:hAnsi="Calibri" w:cs="Calibri"/>
-        </w:rPr>
-        <w:t xml:space="preserve">   </w:t>
+          <w:numId w:val="21"/>
+        </w:numPr>
+        <w:textAlignment w:val="center"/>
+        <w:rPr>
+          <w:rFonts w:ascii="Calibri" w:eastAsia="Times New Roman" w:hAnsi="Calibri" w:cs="Calibri"/>
+        </w:rPr>
+      </w:pPr>
+      <w:r>
+        <w:rPr>
+          <w:rFonts w:ascii="Calibri" w:eastAsia="Times New Roman" w:hAnsi="Calibri" w:cs="Calibri"/>
+        </w:rPr>
+        <w:t xml:space="preserve">Procrastination Logs: See template in Momentum Log Templates.xlsx, "start a 10 minute timer" button   </w:t>
       </w:r>
     </w:p>
     <w:p>
       <w:pPr>
         <w:numPr>
           <w:ilvl w:val="0"/>
-          <w:numId w:val="16"/>
+          <w:numId w:val="21"/>
         </w:numPr>
         <w:textAlignment w:val="center"/>
         <w:rPr>
@@ -862,120 +669,66 @@
         <w:rPr>
           <w:rFonts w:ascii="Calibri" w:eastAsia="Times New Roman" w:hAnsi="Calibri" w:cs="Calibri"/>
         </w:rPr>
-        <w:t xml:space="preserve">: User selects from a list of potential risk factors that lead to stronger emotions or decreased focus, and there is an option to write their own risk factors. Options include "Have I been eating consistently?", "Have I been drinking enough water?", "Have I been drinking more alcohol than usual?", "Have I been using any other substances?", "Have I been taking my medication as prescribed", "Have I been sleeping enough", "Have I exercised this week?", "Have I done any fun activities this week?", "Have I connected with a person I care about this week?", "Have I gone outside today?", "Have I done something that makes me feel accomplished or proud of myself this week?". After selecting the risk factor that the user experienced, they can create a task for the day to </w:t>
-      </w:r>
-      <w:proofErr w:type="gramStart"/>
-      <w:r>
-        <w:rPr>
-          <w:rFonts w:ascii="Calibri" w:eastAsia="Times New Roman" w:hAnsi="Calibri" w:cs="Calibri"/>
-        </w:rPr>
-        <w:t>take action</w:t>
-      </w:r>
-      <w:proofErr w:type="gramEnd"/>
-      <w:r>
-        <w:rPr>
-          <w:rFonts w:ascii="Calibri" w:eastAsia="Times New Roman" w:hAnsi="Calibri" w:cs="Calibri"/>
-        </w:rPr>
-        <w:t xml:space="preserve"> against that risk factor. This will be automatically set to </w:t>
-      </w:r>
-      <w:proofErr w:type="gramStart"/>
-      <w:r>
-        <w:rPr>
-          <w:rFonts w:ascii="Calibri" w:eastAsia="Times New Roman" w:hAnsi="Calibri" w:cs="Calibri"/>
-        </w:rPr>
-        <w:t>reoccur</w:t>
-      </w:r>
-      <w:proofErr w:type="gramEnd"/>
-      <w:r>
-        <w:rPr>
-          <w:rFonts w:ascii="Calibri" w:eastAsia="Times New Roman" w:hAnsi="Calibri" w:cs="Calibri"/>
-        </w:rPr>
-        <w:t xml:space="preserve"> daily for the next 2 weeks. </w:t>
-      </w:r>
-      <w:proofErr w:type="gramStart"/>
-      <w:r>
-        <w:rPr>
-          <w:rFonts w:ascii="Calibri" w:eastAsia="Times New Roman" w:hAnsi="Calibri" w:cs="Calibri"/>
-        </w:rPr>
-        <w:t>Also</w:t>
-      </w:r>
-      <w:proofErr w:type="gramEnd"/>
-      <w:r>
-        <w:rPr>
-          <w:rFonts w:ascii="Calibri" w:eastAsia="Times New Roman" w:hAnsi="Calibri" w:cs="Calibri"/>
-        </w:rPr>
-        <w:t xml:space="preserve"> after selecting the risk factor, a procrastination log is also created but are formatted differently as "Procrastination - DD/MM/YY </w:t>
-      </w:r>
-      <w:proofErr w:type="spellStart"/>
-      <w:r>
-        <w:rPr>
-          <w:rFonts w:ascii="Calibri" w:eastAsia="Times New Roman" w:hAnsi="Calibri" w:cs="Calibri"/>
-        </w:rPr>
-        <w:t>hh:mm</w:t>
-      </w:r>
-      <w:proofErr w:type="spellEnd"/>
-      <w:r>
-        <w:rPr>
-          <w:rFonts w:ascii="Calibri" w:eastAsia="Times New Roman" w:hAnsi="Calibri" w:cs="Calibri"/>
-        </w:rPr>
-        <w:t xml:space="preserve"> - lack of &lt;risk factor&gt;</w:t>
-      </w:r>
-      <w:proofErr w:type="gramStart"/>
-      <w:r>
-        <w:rPr>
-          <w:rFonts w:ascii="Calibri" w:eastAsia="Times New Roman" w:hAnsi="Calibri" w:cs="Calibri"/>
-        </w:rPr>
-        <w:t>", and</w:t>
-      </w:r>
-      <w:proofErr w:type="gramEnd"/>
-      <w:r>
-        <w:rPr>
-          <w:rFonts w:ascii="Calibri" w:eastAsia="Times New Roman" w:hAnsi="Calibri" w:cs="Calibri"/>
-        </w:rPr>
-        <w:t xml:space="preserve"> are saved to the Procrastination Logs landing page.</w:t>
+        <w:t>: User selects from a list of potential risk factors that lead to stronger emotions or decreased focus, and there is an option to write their own risk factors. Options include "Have I been eating consistently?", "Have I been drinking enough water?", "Have I been drinking more alcohol than usual?", "Have I been using any other substances?", "Have I been taking my medication as prescribed", "Have I been sleeping enough", "Have I exercised this week?", "Have I done any fun activities this week?", "Have I connected with a person I care about this week?", "Have I gone outside today?", "Have I done something that makes me feel accomplished or proud of myself this week?". After selecting the risk factor that the user experienced, they can create a task for the day to take action against that risk factor. This will be automatically set to reoccur daily for the next 2 weeks. Also after selecting the risk factor, a procrastination log is also created but are formatted differently as "Procrastination - DD/MM/YY hh:mm - lack of &lt;risk factor&gt;", and are saved to the Procrastination Logs landing page.</w:t>
       </w:r>
     </w:p>
     <w:p>
       <w:pPr>
         <w:numPr>
           <w:ilvl w:val="0"/>
-          <w:numId w:val="16"/>
-        </w:numPr>
-        <w:textAlignment w:val="center"/>
-        <w:rPr>
-          <w:rFonts w:ascii="Calibri" w:eastAsia="Times New Roman" w:hAnsi="Calibri" w:cs="Calibri"/>
-        </w:rPr>
-      </w:pPr>
-      <w:proofErr w:type="gramStart"/>
+          <w:numId w:val="21"/>
+        </w:numPr>
+        <w:textAlignment w:val="center"/>
+        <w:rPr>
+          <w:rFonts w:ascii="Calibri" w:eastAsia="Times New Roman" w:hAnsi="Calibri" w:cs="Calibri"/>
+        </w:rPr>
+      </w:pPr>
       <w:r>
         <w:rPr>
           <w:rFonts w:ascii="Calibri" w:eastAsia="Times New Roman" w:hAnsi="Calibri" w:cs="Calibri"/>
           <w:b/>
           <w:bCs/>
         </w:rPr>
-        <w:t>Timers</w:t>
-      </w:r>
-      <w:proofErr w:type="gramEnd"/>
+        <w:t>Timers page</w:t>
+      </w:r>
+      <w:r>
+        <w:rPr>
+          <w:rFonts w:ascii="Calibri" w:eastAsia="Times New Roman" w:hAnsi="Calibri" w:cs="Calibri"/>
+        </w:rPr>
+        <w:t xml:space="preserve">: User can specify a countdown timer for any number of minutes. Any time a procrastination log is created, there is a timer option for 10 minutes. </w:t>
+      </w:r>
+    </w:p>
+    <w:p>
+      <w:pPr>
+        <w:numPr>
+          <w:ilvl w:val="0"/>
+          <w:numId w:val="21"/>
+        </w:numPr>
+        <w:textAlignment w:val="center"/>
+        <w:rPr>
+          <w:rFonts w:ascii="Calibri" w:eastAsia="Times New Roman" w:hAnsi="Calibri" w:cs="Calibri"/>
+        </w:rPr>
+      </w:pPr>
       <w:r>
         <w:rPr>
           <w:rFonts w:ascii="Calibri" w:eastAsia="Times New Roman" w:hAnsi="Calibri" w:cs="Calibri"/>
           <w:b/>
           <w:bCs/>
         </w:rPr>
-        <w:t xml:space="preserve"> page</w:t>
-      </w:r>
-      <w:r>
-        <w:rPr>
-          <w:rFonts w:ascii="Calibri" w:eastAsia="Times New Roman" w:hAnsi="Calibri" w:cs="Calibri"/>
-        </w:rPr>
-        <w:t xml:space="preserve">: User can specify a countdown timer for any number of minutes. Any time a procrastination log is created, there is a timer option for 10 minutes. </w:t>
+        <w:t>Pomodoro Timer page</w:t>
+      </w:r>
+      <w:r>
+        <w:rPr>
+          <w:rFonts w:ascii="Calibri" w:eastAsia="Times New Roman" w:hAnsi="Calibri" w:cs="Calibri"/>
+        </w:rPr>
+        <w:t>: timer incrementing from 0 following the Pomodoro method of 25 minutes of working with a 5 minutes break. Other options for 50/10 split, or a custom split. The timer only increments with productive data. The break notifier pops up when they reach their productive target minutes, specifying how many break minutes they've earned. After finishing their break, it should prompt the user to start the pomodoro timer again, encouraging their hard work. When the user completes their 2nd consecutive pomodoro timers, the break amount should double, suggesting they've earned a longer break. This should continue for every other consecutive pomodoro timers started.</w:t>
       </w:r>
     </w:p>
     <w:p>
       <w:pPr>
         <w:numPr>
           <w:ilvl w:val="0"/>
-          <w:numId w:val="16"/>
+          <w:numId w:val="21"/>
         </w:numPr>
         <w:textAlignment w:val="center"/>
         <w:rPr>
@@ -988,50 +741,31 @@
           <w:b/>
           <w:bCs/>
         </w:rPr>
-        <w:t>Pomodoro Timer page</w:t>
-      </w:r>
-      <w:r>
-        <w:rPr>
-          <w:rFonts w:ascii="Calibri" w:eastAsia="Times New Roman" w:hAnsi="Calibri" w:cs="Calibri"/>
-        </w:rPr>
-        <w:t xml:space="preserve">: timer incrementing from 0 following the Pomodoro method of 25 minutes of working with a 5 </w:t>
-      </w:r>
-      <w:proofErr w:type="gramStart"/>
-      <w:r>
-        <w:rPr>
-          <w:rFonts w:ascii="Calibri" w:eastAsia="Times New Roman" w:hAnsi="Calibri" w:cs="Calibri"/>
-        </w:rPr>
-        <w:t>minutes</w:t>
-      </w:r>
-      <w:proofErr w:type="gramEnd"/>
-      <w:r>
-        <w:rPr>
-          <w:rFonts w:ascii="Calibri" w:eastAsia="Times New Roman" w:hAnsi="Calibri" w:cs="Calibri"/>
-        </w:rPr>
-        <w:t xml:space="preserve"> break. Other options for 50/10 split, or a custom split. The timer only </w:t>
-      </w:r>
-      <w:proofErr w:type="gramStart"/>
-      <w:r>
-        <w:rPr>
-          <w:rFonts w:ascii="Calibri" w:eastAsia="Times New Roman" w:hAnsi="Calibri" w:cs="Calibri"/>
-        </w:rPr>
-        <w:t>increments</w:t>
-      </w:r>
-      <w:proofErr w:type="gramEnd"/>
-      <w:r>
-        <w:rPr>
-          <w:rFonts w:ascii="Calibri" w:eastAsia="Times New Roman" w:hAnsi="Calibri" w:cs="Calibri"/>
-        </w:rPr>
-        <w:t xml:space="preserve"> with productive data. The break notifier pops up when they reach their productive target minutes, specifying how many break minutes they've earned. After finishing their break, it should prompt the user to start the pomodoro timer again, encouraging their hard work. When the user completes their 2nd consecutive pomodoro timers, the break amount should double, suggesting they've earned a longer break. This should continue for every other consecutive pomodoro timers started.</w:t>
-      </w:r>
-    </w:p>
-    <w:p>
-      <w:pPr>
-        <w:numPr>
-          <w:ilvl w:val="0"/>
-          <w:numId w:val="16"/>
-        </w:numPr>
-        <w:textAlignment w:val="center"/>
+        <w:t>Break notifier popup</w:t>
+      </w:r>
+      <w:r>
+        <w:rPr>
+          <w:rFonts w:ascii="Calibri" w:eastAsia="Times New Roman" w:hAnsi="Calibri" w:cs="Calibri"/>
+        </w:rPr>
+        <w:t>: This popup page and windows notification occurs when you have been working for 50 minutes straight (productive data only), unless a pomodoro timer is running, in which that break period should be used instead. It should be congratulatory and say "Take a healthy break for 10 minutes, such as a walk around the block (no music), stretching, getting water or a healthy snack, getting fresh air and sunshine, chatting with a friend, a gratitude journal, or breathing/meditating. Visualize what you have accomplished and what you will do during this time."</w:t>
+      </w:r>
+    </w:p>
+    <w:p>
+      <w:pPr>
+        <w:ind w:left="540"/>
+        <w:rPr>
+          <w:rFonts w:ascii="Calibri" w:eastAsia="Times New Roman" w:hAnsi="Calibri" w:cs="Calibri"/>
+        </w:rPr>
+      </w:pPr>
+      <w:r>
+        <w:rPr>
+          <w:rFonts w:ascii="Calibri" w:eastAsia="Times New Roman" w:hAnsi="Calibri" w:cs="Calibri"/>
+        </w:rPr>
+        <w:t> </w:t>
+      </w:r>
+    </w:p>
+    <w:p>
+      <w:pPr>
         <w:rPr>
           <w:rFonts w:ascii="Calibri" w:eastAsia="Times New Roman" w:hAnsi="Calibri" w:cs="Calibri"/>
         </w:rPr>
@@ -1042,18 +776,169 @@
           <w:b/>
           <w:bCs/>
         </w:rPr>
-        <w:t>Break notifier popup</w:t>
-      </w:r>
-      <w:r>
-        <w:rPr>
-          <w:rFonts w:ascii="Calibri" w:eastAsia="Times New Roman" w:hAnsi="Calibri" w:cs="Calibri"/>
-        </w:rPr>
-        <w:t>: This popup page and windows notification occurs when you have been working for 50 minutes straight (productive data only), unless a pomodoro timer is running, in which that break period should be used instead. It should be congratulatory and say "Take a healthy break for 10 minutes, such as a walk around the block (no music), stretching, getting water or a healthy snack, getting fresh air and sunshine, chatting with a friend, a gratitude journal, or breathing/meditating. Visualize what you have accomplished and what you will do during this time."</w:t>
-      </w:r>
-    </w:p>
-    <w:p>
-      <w:pPr>
-        <w:ind w:left="540"/>
+        <w:t>Features: Data Tracking</w:t>
+      </w:r>
+    </w:p>
+    <w:p>
+      <w:pPr>
+        <w:numPr>
+          <w:ilvl w:val="0"/>
+          <w:numId w:val="22"/>
+        </w:numPr>
+        <w:textAlignment w:val="center"/>
+        <w:rPr>
+          <w:rFonts w:ascii="Calibri" w:eastAsia="Times New Roman" w:hAnsi="Calibri" w:cs="Calibri"/>
+        </w:rPr>
+      </w:pPr>
+      <w:r>
+        <w:rPr>
+          <w:rFonts w:ascii="Calibri" w:eastAsia="Times New Roman" w:hAnsi="Calibri" w:cs="Calibri"/>
+        </w:rPr>
+        <w:lastRenderedPageBreak/>
+        <w:t>Productive data: When user is actively using apps or sites from the allowed list, polled every 10 seconds</w:t>
+      </w:r>
+    </w:p>
+    <w:p>
+      <w:pPr>
+        <w:numPr>
+          <w:ilvl w:val="0"/>
+          <w:numId w:val="22"/>
+        </w:numPr>
+        <w:textAlignment w:val="center"/>
+        <w:rPr>
+          <w:rFonts w:ascii="Calibri" w:eastAsia="Times New Roman" w:hAnsi="Calibri" w:cs="Calibri"/>
+        </w:rPr>
+      </w:pPr>
+      <w:r>
+        <w:rPr>
+          <w:rFonts w:ascii="Calibri" w:eastAsia="Times New Roman" w:hAnsi="Calibri" w:cs="Calibri"/>
+        </w:rPr>
+        <w:t xml:space="preserve">Unproductive data: When user is actively using apps or sites from the disallowed list, polled every 10 seconds </w:t>
+      </w:r>
+    </w:p>
+    <w:p>
+      <w:pPr>
+        <w:numPr>
+          <w:ilvl w:val="0"/>
+          <w:numId w:val="22"/>
+        </w:numPr>
+        <w:textAlignment w:val="center"/>
+        <w:rPr>
+          <w:rFonts w:ascii="Calibri" w:eastAsia="Times New Roman" w:hAnsi="Calibri" w:cs="Calibri"/>
+        </w:rPr>
+      </w:pPr>
+      <w:r>
+        <w:rPr>
+          <w:rFonts w:ascii="Calibri" w:eastAsia="Times New Roman" w:hAnsi="Calibri" w:cs="Calibri"/>
+        </w:rPr>
+        <w:t>Not-Sure data: When user is actively using apps or sites not on either list, or when they are on the allowed list but they haven't moved their mouse or pressed a key for 5 minutes. The windows home screen does not count for not-sure data and is not polled.</w:t>
+      </w:r>
+    </w:p>
+    <w:p>
+      <w:pPr>
+        <w:numPr>
+          <w:ilvl w:val="0"/>
+          <w:numId w:val="22"/>
+        </w:numPr>
+        <w:textAlignment w:val="center"/>
+        <w:rPr>
+          <w:rFonts w:ascii="Calibri" w:eastAsia="Times New Roman" w:hAnsi="Calibri" w:cs="Calibri"/>
+        </w:rPr>
+      </w:pPr>
+      <w:r>
+        <w:rPr>
+          <w:rFonts w:ascii="Calibri" w:eastAsia="Times New Roman" w:hAnsi="Calibri" w:cs="Calibri"/>
+        </w:rPr>
+        <w:t>Daily use data: 0 or 1 if user starts the app or if the user makes one click in the app if it is already open. This value resets every morning at 12:00am local time.</w:t>
+      </w:r>
+    </w:p>
+    <w:p>
+      <w:pPr>
+        <w:numPr>
+          <w:ilvl w:val="0"/>
+          <w:numId w:val="22"/>
+        </w:numPr>
+        <w:textAlignment w:val="center"/>
+        <w:rPr>
+          <w:rFonts w:ascii="Calibri" w:eastAsia="Times New Roman" w:hAnsi="Calibri" w:cs="Calibri"/>
+        </w:rPr>
+      </w:pPr>
+      <w:r>
+        <w:rPr>
+          <w:rFonts w:ascii="Calibri" w:eastAsia="Times New Roman" w:hAnsi="Calibri" w:cs="Calibri"/>
+        </w:rPr>
+        <w:t>Total days used: totals users daily use data</w:t>
+      </w:r>
+    </w:p>
+    <w:p>
+      <w:pPr>
+        <w:numPr>
+          <w:ilvl w:val="0"/>
+          <w:numId w:val="22"/>
+        </w:numPr>
+        <w:textAlignment w:val="center"/>
+        <w:rPr>
+          <w:rFonts w:ascii="Calibri" w:eastAsia="Times New Roman" w:hAnsi="Calibri" w:cs="Calibri"/>
+        </w:rPr>
+      </w:pPr>
+      <w:r>
+        <w:rPr>
+          <w:rFonts w:ascii="Calibri" w:eastAsia="Times New Roman" w:hAnsi="Calibri" w:cs="Calibri"/>
+        </w:rPr>
+        <w:t>Consecutive days streak: totals consecutive days, resets to 0 on a skipped day</w:t>
+      </w:r>
+    </w:p>
+    <w:p>
+      <w:pPr>
+        <w:numPr>
+          <w:ilvl w:val="0"/>
+          <w:numId w:val="22"/>
+        </w:numPr>
+        <w:textAlignment w:val="center"/>
+        <w:rPr>
+          <w:rFonts w:ascii="Calibri" w:eastAsia="Times New Roman" w:hAnsi="Calibri" w:cs="Calibri"/>
+        </w:rPr>
+      </w:pPr>
+      <w:r>
+        <w:rPr>
+          <w:rFonts w:ascii="Calibri" w:eastAsia="Times New Roman" w:hAnsi="Calibri" w:cs="Calibri"/>
+        </w:rPr>
+        <w:t>Total days per month: adds up the total days used each month, saves this for each month for trends</w:t>
+      </w:r>
+    </w:p>
+    <w:p>
+      <w:pPr>
+        <w:numPr>
+          <w:ilvl w:val="0"/>
+          <w:numId w:val="22"/>
+        </w:numPr>
+        <w:textAlignment w:val="center"/>
+        <w:rPr>
+          <w:rFonts w:ascii="Calibri" w:eastAsia="Times New Roman" w:hAnsi="Calibri" w:cs="Calibri"/>
+        </w:rPr>
+      </w:pPr>
+      <w:r>
+        <w:rPr>
+          <w:rFonts w:ascii="Calibri" w:eastAsia="Times New Roman" w:hAnsi="Calibri" w:cs="Calibri"/>
+        </w:rPr>
+        <w:t>Data storage and schema architecture: see CLAUDE.md</w:t>
+      </w:r>
+    </w:p>
+    <w:p>
+      <w:pPr>
+        <w:rPr>
+          <w:rFonts w:ascii="Calibri" w:eastAsia="Times New Roman" w:hAnsi="Calibri" w:cs="Calibri"/>
+        </w:rPr>
+      </w:pPr>
+      <w:r>
+        <w:rPr>
+          <w:rFonts w:ascii="Calibri" w:eastAsia="Times New Roman" w:hAnsi="Calibri" w:cs="Calibri"/>
+        </w:rPr>
+        <w:t> </w:t>
+      </w:r>
+    </w:p>
+    <w:p>
+      <w:pPr>
         <w:rPr>
           <w:rFonts w:ascii="Calibri" w:eastAsia="Times New Roman" w:hAnsi="Calibri" w:cs="Calibri"/>
         </w:rPr>
@@ -1077,414 +962,51 @@
           <w:b/>
           <w:bCs/>
         </w:rPr>
-        <w:t>Features: Data Tracking</w:t>
+        <w:t xml:space="preserve">Next features for future iterations: </w:t>
       </w:r>
     </w:p>
     <w:p>
       <w:pPr>
         <w:numPr>
           <w:ilvl w:val="0"/>
-          <w:numId w:val="17"/>
-        </w:numPr>
-        <w:textAlignment w:val="center"/>
-        <w:rPr>
-          <w:rFonts w:ascii="Calibri" w:eastAsia="Times New Roman" w:hAnsi="Calibri" w:cs="Calibri"/>
-        </w:rPr>
-      </w:pPr>
-      <w:r>
-        <w:rPr>
-          <w:rFonts w:ascii="Calibri" w:eastAsia="Times New Roman" w:hAnsi="Calibri" w:cs="Calibri"/>
-        </w:rPr>
-        <w:lastRenderedPageBreak/>
-        <w:t xml:space="preserve">Productive data: When user is actively using apps or sites from the allowed list, </w:t>
-      </w:r>
-      <w:proofErr w:type="gramStart"/>
-      <w:r>
-        <w:rPr>
-          <w:rFonts w:ascii="Calibri" w:eastAsia="Times New Roman" w:hAnsi="Calibri" w:cs="Calibri"/>
-        </w:rPr>
-        <w:t>polled</w:t>
-      </w:r>
-      <w:proofErr w:type="gramEnd"/>
-      <w:r>
-        <w:rPr>
-          <w:rFonts w:ascii="Calibri" w:eastAsia="Times New Roman" w:hAnsi="Calibri" w:cs="Calibri"/>
-        </w:rPr>
-        <w:t xml:space="preserve"> every 10 seconds</w:t>
+          <w:numId w:val="23"/>
+        </w:numPr>
+        <w:textAlignment w:val="center"/>
+        <w:rPr>
+          <w:rFonts w:ascii="Calibri" w:eastAsia="Times New Roman" w:hAnsi="Calibri" w:cs="Calibri"/>
+        </w:rPr>
+      </w:pPr>
+      <w:r>
+        <w:rPr>
+          <w:rFonts w:ascii="Calibri" w:eastAsia="Times New Roman" w:hAnsi="Calibri" w:cs="Calibri"/>
+          <w:highlight w:val="yellow"/>
+        </w:rPr>
+        <w:t>Need to differentiate between file explorer and home screen. App Name: Windows Explorer, Window: Program Manager vs "&lt;folder&gt; - File Explorer"</w:t>
       </w:r>
     </w:p>
     <w:p>
       <w:pPr>
         <w:numPr>
           <w:ilvl w:val="0"/>
-          <w:numId w:val="17"/>
-        </w:numPr>
-        <w:textAlignment w:val="center"/>
-        <w:rPr>
-          <w:rFonts w:ascii="Calibri" w:eastAsia="Times New Roman" w:hAnsi="Calibri" w:cs="Calibri"/>
-        </w:rPr>
-      </w:pPr>
-      <w:r>
-        <w:rPr>
-          <w:rFonts w:ascii="Calibri" w:eastAsia="Times New Roman" w:hAnsi="Calibri" w:cs="Calibri"/>
-        </w:rPr>
-        <w:t xml:space="preserve">Unproductive data: When user is actively using apps or sites from the disallowed list, </w:t>
-      </w:r>
-      <w:proofErr w:type="gramStart"/>
-      <w:r>
-        <w:rPr>
-          <w:rFonts w:ascii="Calibri" w:eastAsia="Times New Roman" w:hAnsi="Calibri" w:cs="Calibri"/>
-        </w:rPr>
-        <w:t>polled</w:t>
-      </w:r>
-      <w:proofErr w:type="gramEnd"/>
-      <w:r>
-        <w:rPr>
-          <w:rFonts w:ascii="Calibri" w:eastAsia="Times New Roman" w:hAnsi="Calibri" w:cs="Calibri"/>
-        </w:rPr>
-        <w:t xml:space="preserve"> every 10 seconds </w:t>
+          <w:numId w:val="23"/>
+        </w:numPr>
+        <w:textAlignment w:val="center"/>
+        <w:rPr>
+          <w:rFonts w:ascii="Calibri" w:eastAsia="Times New Roman" w:hAnsi="Calibri" w:cs="Calibri"/>
+        </w:rPr>
+      </w:pPr>
+      <w:r>
+        <w:rPr>
+          <w:rFonts w:ascii="Calibri" w:eastAsia="Times New Roman" w:hAnsi="Calibri" w:cs="Calibri"/>
+        </w:rPr>
+        <w:t>Dopamine/Avoidance tips (after the first 10 mins functionality is good)</w:t>
       </w:r>
     </w:p>
     <w:p>
       <w:pPr>
         <w:numPr>
           <w:ilvl w:val="0"/>
-          <w:numId w:val="17"/>
-        </w:numPr>
-        <w:textAlignment w:val="center"/>
-        <w:rPr>
-          <w:rFonts w:ascii="Calibri" w:eastAsia="Times New Roman" w:hAnsi="Calibri" w:cs="Calibri"/>
-        </w:rPr>
-      </w:pPr>
-      <w:r>
-        <w:rPr>
-          <w:rFonts w:ascii="Calibri" w:eastAsia="Times New Roman" w:hAnsi="Calibri" w:cs="Calibri"/>
-        </w:rPr>
-        <w:t xml:space="preserve">Not-Sure data: When user is actively using apps or sites not on either list, or when they are on the allowed </w:t>
-      </w:r>
-      <w:proofErr w:type="gramStart"/>
-      <w:r>
-        <w:rPr>
-          <w:rFonts w:ascii="Calibri" w:eastAsia="Times New Roman" w:hAnsi="Calibri" w:cs="Calibri"/>
-        </w:rPr>
-        <w:t>list</w:t>
-      </w:r>
-      <w:proofErr w:type="gramEnd"/>
-      <w:r>
-        <w:rPr>
-          <w:rFonts w:ascii="Calibri" w:eastAsia="Times New Roman" w:hAnsi="Calibri" w:cs="Calibri"/>
-        </w:rPr>
-        <w:t xml:space="preserve"> but they haven't moved their mouse or pressed a key for 5 minutes. The windows home screen does not count for not-sure data and is not polled.</w:t>
-      </w:r>
-    </w:p>
-    <w:p>
-      <w:pPr>
-        <w:numPr>
-          <w:ilvl w:val="0"/>
-          <w:numId w:val="17"/>
-        </w:numPr>
-        <w:textAlignment w:val="center"/>
-        <w:rPr>
-          <w:rFonts w:ascii="Calibri" w:eastAsia="Times New Roman" w:hAnsi="Calibri" w:cs="Calibri"/>
-        </w:rPr>
-      </w:pPr>
-      <w:r>
-        <w:rPr>
-          <w:rFonts w:ascii="Calibri" w:eastAsia="Times New Roman" w:hAnsi="Calibri" w:cs="Calibri"/>
-        </w:rPr>
-        <w:t>Daily use data: 0 or 1 if user starts the app or if the user makes one click in the app if it is already open. This value resets every morning at 12:00am local time.</w:t>
-      </w:r>
-    </w:p>
-    <w:p>
-      <w:pPr>
-        <w:numPr>
-          <w:ilvl w:val="0"/>
-          <w:numId w:val="17"/>
-        </w:numPr>
-        <w:textAlignment w:val="center"/>
-        <w:rPr>
-          <w:rFonts w:ascii="Calibri" w:eastAsia="Times New Roman" w:hAnsi="Calibri" w:cs="Calibri"/>
-        </w:rPr>
-      </w:pPr>
-      <w:r>
-        <w:rPr>
-          <w:rFonts w:ascii="Calibri" w:eastAsia="Times New Roman" w:hAnsi="Calibri" w:cs="Calibri"/>
-        </w:rPr>
-        <w:t>Total days used: totals users daily use data</w:t>
-      </w:r>
-    </w:p>
-    <w:p>
-      <w:pPr>
-        <w:numPr>
-          <w:ilvl w:val="0"/>
-          <w:numId w:val="17"/>
-        </w:numPr>
-        <w:textAlignment w:val="center"/>
-        <w:rPr>
-          <w:rFonts w:ascii="Calibri" w:eastAsia="Times New Roman" w:hAnsi="Calibri" w:cs="Calibri"/>
-        </w:rPr>
-      </w:pPr>
-      <w:r>
-        <w:rPr>
-          <w:rFonts w:ascii="Calibri" w:eastAsia="Times New Roman" w:hAnsi="Calibri" w:cs="Calibri"/>
-        </w:rPr>
-        <w:t xml:space="preserve">Consecutive days </w:t>
-      </w:r>
-      <w:proofErr w:type="gramStart"/>
-      <w:r>
-        <w:rPr>
-          <w:rFonts w:ascii="Calibri" w:eastAsia="Times New Roman" w:hAnsi="Calibri" w:cs="Calibri"/>
-        </w:rPr>
-        <w:t>streak:</w:t>
-      </w:r>
-      <w:proofErr w:type="gramEnd"/>
-      <w:r>
-        <w:rPr>
-          <w:rFonts w:ascii="Calibri" w:eastAsia="Times New Roman" w:hAnsi="Calibri" w:cs="Calibri"/>
-        </w:rPr>
-        <w:t xml:space="preserve"> totals consecutive days, resets to 0 on a skipped day</w:t>
-      </w:r>
-    </w:p>
-    <w:p>
-      <w:pPr>
-        <w:numPr>
-          <w:ilvl w:val="0"/>
-          <w:numId w:val="17"/>
-        </w:numPr>
-        <w:textAlignment w:val="center"/>
-        <w:rPr>
-          <w:rFonts w:ascii="Calibri" w:eastAsia="Times New Roman" w:hAnsi="Calibri" w:cs="Calibri"/>
-        </w:rPr>
-      </w:pPr>
-      <w:r>
-        <w:rPr>
-          <w:rFonts w:ascii="Calibri" w:eastAsia="Times New Roman" w:hAnsi="Calibri" w:cs="Calibri"/>
-        </w:rPr>
-        <w:t xml:space="preserve">Total days per </w:t>
-      </w:r>
-      <w:proofErr w:type="gramStart"/>
-      <w:r>
-        <w:rPr>
-          <w:rFonts w:ascii="Calibri" w:eastAsia="Times New Roman" w:hAnsi="Calibri" w:cs="Calibri"/>
-        </w:rPr>
-        <w:t>month:</w:t>
-      </w:r>
-      <w:proofErr w:type="gramEnd"/>
-      <w:r>
-        <w:rPr>
-          <w:rFonts w:ascii="Calibri" w:eastAsia="Times New Roman" w:hAnsi="Calibri" w:cs="Calibri"/>
-        </w:rPr>
-        <w:t xml:space="preserve"> adds up the total days used each month, saves this for each month for trends</w:t>
-      </w:r>
-    </w:p>
-    <w:p>
-      <w:pPr>
-        <w:rPr>
-          <w:rFonts w:ascii="Calibri" w:eastAsia="Times New Roman" w:hAnsi="Calibri" w:cs="Calibri"/>
-        </w:rPr>
-      </w:pPr>
-      <w:r>
-        <w:rPr>
-          <w:rFonts w:ascii="Calibri" w:eastAsia="Times New Roman" w:hAnsi="Calibri" w:cs="Calibri"/>
-        </w:rPr>
-        <w:t> </w:t>
-      </w:r>
-    </w:p>
-    <w:p>
-      <w:pPr>
-        <w:rPr>
-          <w:rFonts w:ascii="Calibri" w:eastAsia="Times New Roman" w:hAnsi="Calibri" w:cs="Calibri"/>
-        </w:rPr>
-      </w:pPr>
-      <w:r>
-        <w:rPr>
-          <w:rFonts w:ascii="Calibri" w:eastAsia="Times New Roman" w:hAnsi="Calibri" w:cs="Calibri"/>
-          <w:b/>
-          <w:bCs/>
-        </w:rPr>
-        <w:t>Architecture/Functionality Questions</w:t>
-      </w:r>
-    </w:p>
-    <w:p>
-      <w:pPr>
-        <w:numPr>
-          <w:ilvl w:val="0"/>
-          <w:numId w:val="18"/>
-        </w:numPr>
-        <w:textAlignment w:val="center"/>
-        <w:rPr>
-          <w:rFonts w:ascii="Calibri" w:eastAsia="Times New Roman" w:hAnsi="Calibri" w:cs="Calibri"/>
-        </w:rPr>
-      </w:pPr>
-      <w:r>
-        <w:rPr>
-          <w:rFonts w:ascii="Calibri" w:eastAsia="Times New Roman" w:hAnsi="Calibri" w:cs="Calibri"/>
-          <w:highlight w:val="yellow"/>
-        </w:rPr>
-        <w:t>Most efficient way to store data? Uint8 = 1,2,3? SQL language/database type</w:t>
-      </w:r>
-    </w:p>
-    <w:p>
-      <w:pPr>
-        <w:numPr>
-          <w:ilvl w:val="0"/>
-          <w:numId w:val="18"/>
-        </w:numPr>
-        <w:textAlignment w:val="center"/>
-        <w:rPr>
-          <w:rFonts w:ascii="Calibri" w:eastAsia="Times New Roman" w:hAnsi="Calibri" w:cs="Calibri"/>
-        </w:rPr>
-      </w:pPr>
-      <w:r>
-        <w:rPr>
-          <w:rFonts w:ascii="Calibri" w:eastAsia="Times New Roman" w:hAnsi="Calibri" w:cs="Calibri"/>
-          <w:highlight w:val="yellow"/>
-        </w:rPr>
-        <w:t>How is data stored locally?</w:t>
-      </w:r>
-    </w:p>
-    <w:p>
-      <w:pPr>
-        <w:numPr>
-          <w:ilvl w:val="0"/>
-          <w:numId w:val="18"/>
-        </w:numPr>
-        <w:textAlignment w:val="center"/>
-        <w:rPr>
-          <w:rFonts w:ascii="Calibri" w:eastAsia="Times New Roman" w:hAnsi="Calibri" w:cs="Calibri"/>
-        </w:rPr>
-      </w:pPr>
-      <w:r>
-        <w:rPr>
-          <w:rFonts w:ascii="Calibri" w:eastAsia="Times New Roman" w:hAnsi="Calibri" w:cs="Calibri"/>
-          <w:b/>
-          <w:bCs/>
-        </w:rPr>
-        <w:t>Include AI agent monitoring? "Help me get started" feature</w:t>
-      </w:r>
-      <w:r>
-        <w:rPr>
-          <w:rFonts w:ascii="Calibri" w:eastAsia="Times New Roman" w:hAnsi="Calibri" w:cs="Calibri"/>
-        </w:rPr>
-        <w:t xml:space="preserve"> </w:t>
-      </w:r>
-      <w:proofErr w:type="gramStart"/>
-      <w:r>
-        <w:rPr>
-          <w:rFonts w:ascii="Calibri" w:eastAsia="Times New Roman" w:hAnsi="Calibri" w:cs="Calibri"/>
-        </w:rPr>
-        <w:t>Or</w:t>
-      </w:r>
-      <w:proofErr w:type="gramEnd"/>
-      <w:r>
-        <w:rPr>
-          <w:rFonts w:ascii="Calibri" w:eastAsia="Times New Roman" w:hAnsi="Calibri" w:cs="Calibri"/>
-        </w:rPr>
-        <w:t xml:space="preserve"> just algorithmic data analysis + real time execution</w:t>
-      </w:r>
-    </w:p>
-    <w:p>
-      <w:pPr>
-        <w:numPr>
-          <w:ilvl w:val="0"/>
-          <w:numId w:val="18"/>
-        </w:numPr>
-        <w:textAlignment w:val="center"/>
-        <w:rPr>
-          <w:rFonts w:ascii="Calibri" w:eastAsia="Times New Roman" w:hAnsi="Calibri" w:cs="Calibri"/>
-        </w:rPr>
-      </w:pPr>
-      <w:r>
-        <w:rPr>
-          <w:rFonts w:ascii="Calibri" w:eastAsia="Times New Roman" w:hAnsi="Calibri" w:cs="Calibri"/>
-        </w:rPr>
-        <w:t xml:space="preserve">Claude API integration? Enable it to read </w:t>
-      </w:r>
-      <w:proofErr w:type="gramStart"/>
-      <w:r>
-        <w:rPr>
-          <w:rFonts w:ascii="Calibri" w:eastAsia="Times New Roman" w:hAnsi="Calibri" w:cs="Calibri"/>
-        </w:rPr>
-        <w:t>everything</w:t>
-      </w:r>
-      <w:proofErr w:type="gramEnd"/>
-      <w:r>
-        <w:rPr>
-          <w:rFonts w:ascii="Calibri" w:eastAsia="Times New Roman" w:hAnsi="Calibri" w:cs="Calibri"/>
-        </w:rPr>
-        <w:t xml:space="preserve"> your inbox and populate what your to-do list</w:t>
-      </w:r>
-    </w:p>
-    <w:p>
-      <w:pPr>
-        <w:rPr>
-          <w:rFonts w:ascii="Calibri" w:eastAsia="Times New Roman" w:hAnsi="Calibri" w:cs="Calibri"/>
-        </w:rPr>
-      </w:pPr>
-      <w:r>
-        <w:rPr>
-          <w:rFonts w:ascii="Calibri" w:eastAsia="Times New Roman" w:hAnsi="Calibri" w:cs="Calibri"/>
-        </w:rPr>
-        <w:t> </w:t>
-      </w:r>
-    </w:p>
-    <w:p>
-      <w:pPr>
-        <w:rPr>
-          <w:rFonts w:ascii="Calibri" w:eastAsia="Times New Roman" w:hAnsi="Calibri" w:cs="Calibri"/>
-        </w:rPr>
-      </w:pPr>
-      <w:r>
-        <w:rPr>
-          <w:rFonts w:ascii="Calibri" w:eastAsia="Times New Roman" w:hAnsi="Calibri" w:cs="Calibri"/>
-          <w:b/>
-          <w:bCs/>
-        </w:rPr>
-        <w:t xml:space="preserve">Next features for future iterations: </w:t>
-      </w:r>
-    </w:p>
-    <w:p>
-      <w:pPr>
-        <w:numPr>
-          <w:ilvl w:val="0"/>
-          <w:numId w:val="19"/>
-        </w:numPr>
-        <w:textAlignment w:val="center"/>
-        <w:rPr>
-          <w:rFonts w:ascii="Calibri" w:eastAsia="Times New Roman" w:hAnsi="Calibri" w:cs="Calibri"/>
-        </w:rPr>
-      </w:pPr>
-      <w:r>
-        <w:rPr>
-          <w:rFonts w:ascii="Calibri" w:eastAsia="Times New Roman" w:hAnsi="Calibri" w:cs="Calibri"/>
-          <w:highlight w:val="yellow"/>
-        </w:rPr>
-        <w:t>Need to differentiate between file explorer and home screen. App Name: Windows Explorer, Window: Program Manager vs "&lt;folder&gt; - File Explorer"</w:t>
-      </w:r>
-    </w:p>
-    <w:p>
-      <w:pPr>
-        <w:numPr>
-          <w:ilvl w:val="0"/>
-          <w:numId w:val="19"/>
-        </w:numPr>
-        <w:textAlignment w:val="center"/>
-        <w:rPr>
-          <w:rFonts w:ascii="Calibri" w:eastAsia="Times New Roman" w:hAnsi="Calibri" w:cs="Calibri"/>
-        </w:rPr>
-      </w:pPr>
-      <w:r>
-        <w:rPr>
-          <w:rFonts w:ascii="Calibri" w:eastAsia="Times New Roman" w:hAnsi="Calibri" w:cs="Calibri"/>
-        </w:rPr>
-        <w:t>Dopamine/Avoidance tips (after the first 10 mins functionality is good)</w:t>
-      </w:r>
-    </w:p>
-    <w:p>
-      <w:pPr>
-        <w:numPr>
-          <w:ilvl w:val="0"/>
-          <w:numId w:val="19"/>
+          <w:numId w:val="23"/>
         </w:numPr>
         <w:textAlignment w:val="center"/>
         <w:rPr>
@@ -1497,10 +1019,10 @@
           <w:noProof/>
         </w:rPr>
         <w:drawing>
-          <wp:inline distT="0" distB="0" distL="0" distR="0" wp14:anchorId="2CD1EEBD" wp14:editId="060FC541">
-            <wp:extent cx="2990850" cy="1238250"/>
-            <wp:effectExtent l="0" t="0" r="0" b="0"/>
-            <wp:docPr id="8" name="Picture 3" descr="The image illustrates a four-step process for engaging in a focused state: pre-loading, activation, immersion, and exit protocol.&#10;&#10;AI-generated content may be incorrect."/>
+          <wp:inline distT="0" distB="0" distL="0" distR="0" wp14:anchorId="5D274D07" wp14:editId="126480C7">
+            <wp:extent cx="2987040" cy="1234440"/>
+            <wp:effectExtent l="0" t="0" r="3810" b="3810"/>
+            <wp:docPr id="13" name="Picture 6" descr="The image illustrates a four-step process for engaging in a focused state: pre-loading, activation, immersion, and exit protocol.&#10;&#10;AI-generated content may be incorrect."/>
             <wp:cNvGraphicFramePr>
               <a:graphicFrameLocks xmlns:a="http://schemas.openxmlformats.org/drawingml/2006/main" noChangeAspect="1"/>
             </wp:cNvGraphicFramePr>
@@ -1508,7 +1030,7 @@
               <a:graphicData uri="http://schemas.openxmlformats.org/drawingml/2006/picture">
                 <pic:pic xmlns:pic="http://schemas.openxmlformats.org/drawingml/2006/picture">
                   <pic:nvPicPr>
-                    <pic:cNvPr id="8" name="Picture 3" descr="The image illustrates a four-step process for engaging in a focused state: pre-loading, activation, immersion, and exit protocol.&#10;&#10;AI-generated content may be incorrect."/>
+                    <pic:cNvPr id="13" name="Picture 6" descr="The image illustrates a four-step process for engaging in a focused state: pre-loading, activation, immersion, and exit protocol.&#10;&#10;AI-generated content may be incorrect."/>
                     <pic:cNvPicPr>
                       <a:picLocks noChangeAspect="1" noChangeArrowheads="1"/>
                     </pic:cNvPicPr>
@@ -1529,7 +1051,7 @@
                   <pic:spPr bwMode="auto">
                     <a:xfrm>
                       <a:off x="0" y="0"/>
-                      <a:ext cx="2990850" cy="1238250"/>
+                      <a:ext cx="2987040" cy="1234440"/>
                     </a:xfrm>
                     <a:prstGeom prst="rect">
                       <a:avLst/>
@@ -1550,47 +1072,25 @@
       <w:pPr>
         <w:numPr>
           <w:ilvl w:val="1"/>
-          <w:numId w:val="19"/>
-        </w:numPr>
-        <w:textAlignment w:val="center"/>
-        <w:rPr>
-          <w:rFonts w:ascii="Calibri" w:eastAsia="Times New Roman" w:hAnsi="Calibri" w:cs="Calibri"/>
-        </w:rPr>
-      </w:pPr>
-      <w:r>
-        <w:rPr>
-          <w:rFonts w:ascii="Calibri" w:eastAsia="Times New Roman" w:hAnsi="Calibri" w:cs="Calibri"/>
-        </w:rPr>
-        <w:t xml:space="preserve">What are a few things that lock you </w:t>
-      </w:r>
-      <w:proofErr w:type="gramStart"/>
-      <w:r>
-        <w:rPr>
-          <w:rFonts w:ascii="Calibri" w:eastAsia="Times New Roman" w:hAnsi="Calibri" w:cs="Calibri"/>
-        </w:rPr>
-        <w:t>into</w:t>
-      </w:r>
-      <w:proofErr w:type="gramEnd"/>
-      <w:r>
-        <w:rPr>
-          <w:rFonts w:ascii="Calibri" w:eastAsia="Times New Roman" w:hAnsi="Calibri" w:cs="Calibri"/>
-        </w:rPr>
-        <w:t xml:space="preserve"> your work? Music recs (playlists/sets &gt; 1hr long), standing desk, public setting, </w:t>
-      </w:r>
-      <w:proofErr w:type="spellStart"/>
-      <w:r>
-        <w:rPr>
-          <w:rFonts w:ascii="Calibri" w:eastAsia="Times New Roman" w:hAnsi="Calibri" w:cs="Calibri"/>
-        </w:rPr>
-        <w:t>etc</w:t>
-      </w:r>
-      <w:proofErr w:type="spellEnd"/>
+          <w:numId w:val="23"/>
+        </w:numPr>
+        <w:textAlignment w:val="center"/>
+        <w:rPr>
+          <w:rFonts w:ascii="Calibri" w:eastAsia="Times New Roman" w:hAnsi="Calibri" w:cs="Calibri"/>
+        </w:rPr>
+      </w:pPr>
+      <w:r>
+        <w:rPr>
+          <w:rFonts w:ascii="Calibri" w:eastAsia="Times New Roman" w:hAnsi="Calibri" w:cs="Calibri"/>
+        </w:rPr>
+        <w:t>What are a few things that lock you into your work? Music recs (playlists/sets &gt; 1hr long), standing desk, public setting, etc</w:t>
+      </w:r>
     </w:p>
     <w:p>
       <w:pPr>
         <w:numPr>
           <w:ilvl w:val="1"/>
-          <w:numId w:val="19"/>
+          <w:numId w:val="23"/>
         </w:numPr>
         <w:textAlignment w:val="center"/>
         <w:rPr>
@@ -1608,7 +1108,7 @@
       <w:pPr>
         <w:numPr>
           <w:ilvl w:val="0"/>
-          <w:numId w:val="19"/>
+          <w:numId w:val="23"/>
         </w:numPr>
         <w:textAlignment w:val="center"/>
         <w:rPr>
@@ -1626,7 +1126,7 @@
       <w:pPr>
         <w:numPr>
           <w:ilvl w:val="0"/>
-          <w:numId w:val="19"/>
+          <w:numId w:val="23"/>
         </w:numPr>
         <w:textAlignment w:val="center"/>
         <w:rPr>
@@ -1644,71 +1144,79 @@
       <w:pPr>
         <w:numPr>
           <w:ilvl w:val="0"/>
-          <w:numId w:val="19"/>
-        </w:numPr>
-        <w:textAlignment w:val="center"/>
-        <w:rPr>
-          <w:rFonts w:ascii="Calibri" w:eastAsia="Times New Roman" w:hAnsi="Calibri" w:cs="Calibri"/>
-        </w:rPr>
-      </w:pPr>
-      <w:r>
-        <w:rPr>
-          <w:rFonts w:ascii="Calibri" w:eastAsia="Times New Roman" w:hAnsi="Calibri" w:cs="Calibri"/>
-        </w:rPr>
-        <w:t xml:space="preserve">Test </w:t>
-      </w:r>
-      <w:proofErr w:type="spellStart"/>
-      <w:r>
-        <w:rPr>
-          <w:rFonts w:ascii="Calibri" w:eastAsia="Times New Roman" w:hAnsi="Calibri" w:cs="Calibri"/>
-        </w:rPr>
-        <w:t>Youtube</w:t>
-      </w:r>
-      <w:proofErr w:type="spellEnd"/>
-      <w:r>
-        <w:rPr>
-          <w:rFonts w:ascii="Calibri" w:eastAsia="Times New Roman" w:hAnsi="Calibri" w:cs="Calibri"/>
-        </w:rPr>
-        <w:t xml:space="preserve"> video up on half of a monitor?</w:t>
+          <w:numId w:val="23"/>
+        </w:numPr>
+        <w:textAlignment w:val="center"/>
+        <w:rPr>
+          <w:rFonts w:ascii="Calibri" w:eastAsia="Times New Roman" w:hAnsi="Calibri" w:cs="Calibri"/>
+        </w:rPr>
+      </w:pPr>
+      <w:r>
+        <w:rPr>
+          <w:rFonts w:ascii="Calibri" w:eastAsia="Times New Roman" w:hAnsi="Calibri" w:cs="Calibri"/>
+        </w:rPr>
+        <w:t>"Help me get started" feature</w:t>
       </w:r>
     </w:p>
     <w:p>
       <w:pPr>
         <w:numPr>
           <w:ilvl w:val="0"/>
-          <w:numId w:val="19"/>
-        </w:numPr>
-        <w:textAlignment w:val="center"/>
-        <w:rPr>
-          <w:rFonts w:ascii="Calibri" w:eastAsia="Times New Roman" w:hAnsi="Calibri" w:cs="Calibri"/>
-        </w:rPr>
-      </w:pPr>
-      <w:r>
-        <w:rPr>
-          <w:rFonts w:ascii="Calibri" w:eastAsia="Times New Roman" w:hAnsi="Calibri" w:cs="Calibri"/>
-        </w:rPr>
-        <w:t>Back up claims in prompts with evidence. "</w:t>
-      </w:r>
-      <w:proofErr w:type="gramStart"/>
-      <w:r>
-        <w:rPr>
-          <w:rFonts w:ascii="Calibri" w:eastAsia="Times New Roman" w:hAnsi="Calibri" w:cs="Calibri"/>
-        </w:rPr>
-        <w:t>studies</w:t>
-      </w:r>
-      <w:proofErr w:type="gramEnd"/>
-      <w:r>
-        <w:rPr>
-          <w:rFonts w:ascii="Calibri" w:eastAsia="Times New Roman" w:hAnsi="Calibri" w:cs="Calibri"/>
-        </w:rPr>
-        <w:t xml:space="preserve"> show that X is effective" + hyperlink</w:t>
+          <w:numId w:val="23"/>
+        </w:numPr>
+        <w:textAlignment w:val="center"/>
+        <w:rPr>
+          <w:rFonts w:ascii="Calibri" w:eastAsia="Times New Roman" w:hAnsi="Calibri" w:cs="Calibri"/>
+        </w:rPr>
+      </w:pPr>
+      <w:r>
+        <w:rPr>
+          <w:rFonts w:ascii="Calibri" w:eastAsia="Times New Roman" w:hAnsi="Calibri" w:cs="Calibri"/>
+        </w:rPr>
+        <w:t>Claude API integration? Enable it to read everything your inbox and populate what your to-do list</w:t>
       </w:r>
     </w:p>
     <w:p>
       <w:pPr>
         <w:numPr>
           <w:ilvl w:val="0"/>
-          <w:numId w:val="19"/>
+          <w:numId w:val="23"/>
+        </w:numPr>
+        <w:textAlignment w:val="center"/>
+        <w:rPr>
+          <w:rFonts w:ascii="Calibri" w:eastAsia="Times New Roman" w:hAnsi="Calibri" w:cs="Calibri"/>
+        </w:rPr>
+      </w:pPr>
+      <w:r>
+        <w:rPr>
+          <w:rFonts w:ascii="Calibri" w:eastAsia="Times New Roman" w:hAnsi="Calibri" w:cs="Calibri"/>
+        </w:rPr>
+        <w:t>Test Youtube video up on half of a monitor?</w:t>
+      </w:r>
+    </w:p>
+    <w:p>
+      <w:pPr>
+        <w:numPr>
+          <w:ilvl w:val="0"/>
+          <w:numId w:val="23"/>
+        </w:numPr>
+        <w:textAlignment w:val="center"/>
+        <w:rPr>
+          <w:rFonts w:ascii="Calibri" w:eastAsia="Times New Roman" w:hAnsi="Calibri" w:cs="Calibri"/>
+        </w:rPr>
+      </w:pPr>
+      <w:r>
+        <w:rPr>
+          <w:rFonts w:ascii="Calibri" w:eastAsia="Times New Roman" w:hAnsi="Calibri" w:cs="Calibri"/>
+        </w:rPr>
+        <w:t>Back up claims in prompts with evidence. "studies show that X is effective" + hyperlink</w:t>
+      </w:r>
+    </w:p>
+    <w:p>
+      <w:pPr>
+        <w:numPr>
+          <w:ilvl w:val="0"/>
+          <w:numId w:val="23"/>
         </w:numPr>
         <w:textAlignment w:val="center"/>
         <w:rPr>
@@ -1726,7 +1234,7 @@
       <w:pPr>
         <w:numPr>
           <w:ilvl w:val="0"/>
-          <w:numId w:val="19"/>
+          <w:numId w:val="23"/>
         </w:numPr>
         <w:textAlignment w:val="center"/>
         <w:rPr>
@@ -1744,33 +1252,25 @@
       <w:pPr>
         <w:numPr>
           <w:ilvl w:val="0"/>
-          <w:numId w:val="19"/>
-        </w:numPr>
-        <w:textAlignment w:val="center"/>
-        <w:rPr>
-          <w:rFonts w:ascii="Calibri" w:eastAsia="Times New Roman" w:hAnsi="Calibri" w:cs="Calibri"/>
-        </w:rPr>
-      </w:pPr>
-      <w:proofErr w:type="spellStart"/>
-      <w:r>
-        <w:rPr>
-          <w:rFonts w:ascii="Calibri" w:eastAsia="Times New Roman" w:hAnsi="Calibri" w:cs="Calibri"/>
-        </w:rPr>
-        <w:t>Milestoning</w:t>
-      </w:r>
-      <w:proofErr w:type="spellEnd"/>
-      <w:r>
-        <w:rPr>
-          <w:rFonts w:ascii="Calibri" w:eastAsia="Times New Roman" w:hAnsi="Calibri" w:cs="Calibri"/>
-        </w:rPr>
-        <w:t xml:space="preserve"> with timeline constraints so you are forced to complete things faster</w:t>
+          <w:numId w:val="23"/>
+        </w:numPr>
+        <w:textAlignment w:val="center"/>
+        <w:rPr>
+          <w:rFonts w:ascii="Calibri" w:eastAsia="Times New Roman" w:hAnsi="Calibri" w:cs="Calibri"/>
+        </w:rPr>
+      </w:pPr>
+      <w:r>
+        <w:rPr>
+          <w:rFonts w:ascii="Calibri" w:eastAsia="Times New Roman" w:hAnsi="Calibri" w:cs="Calibri"/>
+        </w:rPr>
+        <w:t>Milestoning with timeline constraints so you are forced to complete things faster</w:t>
       </w:r>
     </w:p>
     <w:p>
       <w:pPr>
         <w:numPr>
           <w:ilvl w:val="1"/>
-          <w:numId w:val="19"/>
+          <w:numId w:val="23"/>
         </w:numPr>
         <w:textAlignment w:val="center"/>
         <w:rPr>
@@ -1788,7 +1288,61 @@
       <w:pPr>
         <w:numPr>
           <w:ilvl w:val="1"/>
-          <w:numId w:val="19"/>
+          <w:numId w:val="23"/>
+        </w:numPr>
+        <w:textAlignment w:val="center"/>
+        <w:rPr>
+          <w:rFonts w:ascii="Calibri" w:eastAsia="Times New Roman" w:hAnsi="Calibri" w:cs="Calibri"/>
+        </w:rPr>
+      </w:pPr>
+      <w:r>
+        <w:rPr>
+          <w:rFonts w:ascii="Calibri" w:eastAsia="Times New Roman" w:hAnsi="Calibri" w:cs="Calibri"/>
+        </w:rPr>
+        <w:t>Ex: automatically donate to charity if you don't finish before deadline</w:t>
+      </w:r>
+    </w:p>
+    <w:p>
+      <w:pPr>
+        <w:numPr>
+          <w:ilvl w:val="0"/>
+          <w:numId w:val="23"/>
+        </w:numPr>
+        <w:textAlignment w:val="center"/>
+        <w:rPr>
+          <w:rFonts w:ascii="Calibri" w:eastAsia="Times New Roman" w:hAnsi="Calibri" w:cs="Calibri"/>
+        </w:rPr>
+      </w:pPr>
+      <w:r>
+        <w:rPr>
+          <w:rFonts w:ascii="Calibri" w:eastAsia="Times New Roman" w:hAnsi="Calibri" w:cs="Calibri"/>
+        </w:rPr>
+        <w:t>Data transparency page: "How your data is being used"</w:t>
+      </w:r>
+    </w:p>
+    <w:p>
+      <w:pPr>
+        <w:numPr>
+          <w:ilvl w:val="0"/>
+          <w:numId w:val="23"/>
+        </w:numPr>
+        <w:textAlignment w:val="center"/>
+        <w:rPr>
+          <w:rFonts w:ascii="Calibri" w:eastAsia="Times New Roman" w:hAnsi="Calibri" w:cs="Calibri"/>
+        </w:rPr>
+      </w:pPr>
+      <w:r>
+        <w:rPr>
+          <w:rFonts w:ascii="Calibri" w:eastAsia="Times New Roman" w:hAnsi="Calibri" w:cs="Calibri"/>
+        </w:rPr>
+        <w:t>"Stop Momentum" feature for personal computer time</w:t>
+      </w:r>
+    </w:p>
+    <w:p>
+      <w:pPr>
+        <w:numPr>
+          <w:ilvl w:val="0"/>
+          <w:numId w:val="23"/>
         </w:numPr>
         <w:textAlignment w:val="center"/>
         <w:rPr>
@@ -1800,122 +1354,68 @@
           <w:rFonts w:ascii="Calibri" w:eastAsia="Times New Roman" w:hAnsi="Calibri" w:cs="Calibri"/>
         </w:rPr>
         <w:lastRenderedPageBreak/>
-        <w:t>Ex: automatically donate to charity if you don't finish before deadline</w:t>
+        <w:t>Partnership with Therapy services such as Lyra Health to prompt users to get help if their data is trending down</w:t>
       </w:r>
     </w:p>
     <w:p>
       <w:pPr>
         <w:numPr>
           <w:ilvl w:val="0"/>
-          <w:numId w:val="19"/>
-        </w:numPr>
-        <w:textAlignment w:val="center"/>
-        <w:rPr>
-          <w:rFonts w:ascii="Calibri" w:eastAsia="Times New Roman" w:hAnsi="Calibri" w:cs="Calibri"/>
-        </w:rPr>
-      </w:pPr>
-      <w:r>
-        <w:rPr>
-          <w:rFonts w:ascii="Calibri" w:eastAsia="Times New Roman" w:hAnsi="Calibri" w:cs="Calibri"/>
-        </w:rPr>
-        <w:t>Data transparency page: "How your data is being used"</w:t>
+          <w:numId w:val="23"/>
+        </w:numPr>
+        <w:textAlignment w:val="center"/>
+        <w:rPr>
+          <w:rFonts w:ascii="Calibri" w:eastAsia="Times New Roman" w:hAnsi="Calibri" w:cs="Calibri"/>
+        </w:rPr>
+      </w:pPr>
+      <w:r>
+        <w:rPr>
+          <w:rFonts w:ascii="Calibri" w:eastAsia="Times New Roman" w:hAnsi="Calibri" w:cs="Calibri"/>
+        </w:rPr>
+        <w:t>Phone app that syncs with your computer for anything non-work related</w:t>
       </w:r>
     </w:p>
     <w:p>
       <w:pPr>
         <w:numPr>
           <w:ilvl w:val="0"/>
-          <w:numId w:val="19"/>
-        </w:numPr>
-        <w:textAlignment w:val="center"/>
-        <w:rPr>
-          <w:rFonts w:ascii="Calibri" w:eastAsia="Times New Roman" w:hAnsi="Calibri" w:cs="Calibri"/>
-        </w:rPr>
-      </w:pPr>
-      <w:r>
-        <w:rPr>
-          <w:rFonts w:ascii="Calibri" w:eastAsia="Times New Roman" w:hAnsi="Calibri" w:cs="Calibri"/>
-        </w:rPr>
-        <w:t>"Stop Momentum" feature for personal computer time</w:t>
+          <w:numId w:val="23"/>
+        </w:numPr>
+        <w:textAlignment w:val="center"/>
+        <w:rPr>
+          <w:rFonts w:ascii="Calibri" w:eastAsia="Times New Roman" w:hAnsi="Calibri" w:cs="Calibri"/>
+        </w:rPr>
+      </w:pPr>
+      <w:r>
+        <w:rPr>
+          <w:rFonts w:ascii="Calibri" w:eastAsia="Times New Roman" w:hAnsi="Calibri" w:cs="Calibri"/>
+        </w:rPr>
+        <w:t>Voice control via phone and computer</w:t>
       </w:r>
     </w:p>
     <w:p>
       <w:pPr>
         <w:numPr>
           <w:ilvl w:val="0"/>
-          <w:numId w:val="19"/>
-        </w:numPr>
-        <w:textAlignment w:val="center"/>
-        <w:rPr>
-          <w:rFonts w:ascii="Calibri" w:eastAsia="Times New Roman" w:hAnsi="Calibri" w:cs="Calibri"/>
-        </w:rPr>
-      </w:pPr>
-      <w:r>
-        <w:rPr>
-          <w:rFonts w:ascii="Calibri" w:eastAsia="Times New Roman" w:hAnsi="Calibri" w:cs="Calibri"/>
-        </w:rPr>
-        <w:t>Partnership with Therapy services such as Lyra Health to prompt users to get help if their data is trending down</w:t>
+          <w:numId w:val="23"/>
+        </w:numPr>
+        <w:textAlignment w:val="center"/>
+        <w:rPr>
+          <w:rFonts w:ascii="Calibri" w:eastAsia="Times New Roman" w:hAnsi="Calibri" w:cs="Calibri"/>
+        </w:rPr>
+      </w:pPr>
+      <w:r>
+        <w:rPr>
+          <w:rFonts w:ascii="Calibri" w:eastAsia="Times New Roman" w:hAnsi="Calibri" w:cs="Calibri"/>
+        </w:rPr>
+        <w:t>Life Coach AI Agent</w:t>
       </w:r>
     </w:p>
     <w:p>
       <w:pPr>
         <w:numPr>
           <w:ilvl w:val="0"/>
-          <w:numId w:val="19"/>
-        </w:numPr>
-        <w:textAlignment w:val="center"/>
-        <w:rPr>
-          <w:rFonts w:ascii="Calibri" w:eastAsia="Times New Roman" w:hAnsi="Calibri" w:cs="Calibri"/>
-        </w:rPr>
-      </w:pPr>
-      <w:r>
-        <w:rPr>
-          <w:rFonts w:ascii="Calibri" w:eastAsia="Times New Roman" w:hAnsi="Calibri" w:cs="Calibri"/>
-        </w:rPr>
-        <w:t>Phone app that syncs with your computer for anything non-work related</w:t>
-      </w:r>
-    </w:p>
-    <w:p>
-      <w:pPr>
-        <w:numPr>
-          <w:ilvl w:val="0"/>
-          <w:numId w:val="19"/>
-        </w:numPr>
-        <w:textAlignment w:val="center"/>
-        <w:rPr>
-          <w:rFonts w:ascii="Calibri" w:eastAsia="Times New Roman" w:hAnsi="Calibri" w:cs="Calibri"/>
-        </w:rPr>
-      </w:pPr>
-      <w:r>
-        <w:rPr>
-          <w:rFonts w:ascii="Calibri" w:eastAsia="Times New Roman" w:hAnsi="Calibri" w:cs="Calibri"/>
-        </w:rPr>
-        <w:t>Voice control via phone and computer</w:t>
-      </w:r>
-    </w:p>
-    <w:p>
-      <w:pPr>
-        <w:numPr>
-          <w:ilvl w:val="0"/>
-          <w:numId w:val="19"/>
-        </w:numPr>
-        <w:textAlignment w:val="center"/>
-        <w:rPr>
-          <w:rFonts w:ascii="Calibri" w:eastAsia="Times New Roman" w:hAnsi="Calibri" w:cs="Calibri"/>
-        </w:rPr>
-      </w:pPr>
-      <w:r>
-        <w:rPr>
-          <w:rFonts w:ascii="Calibri" w:eastAsia="Times New Roman" w:hAnsi="Calibri" w:cs="Calibri"/>
-        </w:rPr>
-        <w:t>Life Coach AI Agent</w:t>
-      </w:r>
-    </w:p>
-    <w:p>
-      <w:pPr>
-        <w:numPr>
-          <w:ilvl w:val="0"/>
-          <w:numId w:val="19"/>
+          <w:numId w:val="23"/>
         </w:numPr>
         <w:textAlignment w:val="center"/>
         <w:rPr>
@@ -1935,25 +1435,7 @@
             <w:color w:val="0000FF"/>
             <w:u w:val="single"/>
           </w:rPr>
-          <w:t>I deleted every habit app and went back to Apple Reminders. 8 months later I have thoughts</w:t>
-        </w:r>
-        <w:proofErr w:type="gramStart"/>
-        <w:r>
-          <w:rPr>
-            <w:rFonts w:ascii="Calibri" w:eastAsia="Times New Roman" w:hAnsi="Calibri" w:cs="Calibri"/>
-            <w:color w:val="0000FF"/>
-            <w:u w:val="single"/>
-          </w:rPr>
-          <w:t>. :</w:t>
-        </w:r>
-        <w:proofErr w:type="gramEnd"/>
-        <w:r>
-          <w:rPr>
-            <w:rFonts w:ascii="Calibri" w:eastAsia="Times New Roman" w:hAnsi="Calibri" w:cs="Calibri"/>
-            <w:color w:val="0000FF"/>
-            <w:u w:val="single"/>
-          </w:rPr>
-          <w:t xml:space="preserve"> r/Habits</w:t>
+          <w:t>I deleted every habit app and went back to Apple Reminders. 8 months later I have thoughts. : r/Habits</w:t>
         </w:r>
       </w:hyperlink>
     </w:p>
@@ -1961,7 +1443,7 @@
       <w:pPr>
         <w:numPr>
           <w:ilvl w:val="0"/>
-          <w:numId w:val="19"/>
+          <w:numId w:val="23"/>
         </w:numPr>
         <w:textAlignment w:val="center"/>
         <w:rPr>
@@ -1979,7 +1461,7 @@
       <w:pPr>
         <w:numPr>
           <w:ilvl w:val="1"/>
-          <w:numId w:val="19"/>
+          <w:numId w:val="23"/>
         </w:numPr>
         <w:textAlignment w:val="center"/>
         <w:rPr>
@@ -1997,7 +1479,7 @@
       <w:pPr>
         <w:numPr>
           <w:ilvl w:val="0"/>
-          <w:numId w:val="19"/>
+          <w:numId w:val="23"/>
         </w:numPr>
         <w:textAlignment w:val="center"/>
         <w:rPr>
@@ -2038,15 +1520,7 @@
         <w:t> </w:t>
       </w:r>
     </w:p>
-    <w:p>
-      <w:pPr>
-        <w:pStyle w:val="NormalWeb"/>
-        <w:spacing w:before="0" w:beforeAutospacing="0" w:after="0" w:afterAutospacing="0"/>
-        <w:rPr>
-          <w:rFonts w:ascii="Calibri" w:hAnsi="Calibri" w:cs="Calibri"/>
-        </w:rPr>
-      </w:pPr>
-    </w:p>
+    <w:p/>
     <w:sectPr>
       <w:pgSz w:w="12240" w:h="15840"/>
       <w:pgMar w:top="1440" w:right="1440" w:bottom="1440" w:left="1440" w:header="720" w:footer="720" w:gutter="0"/>
@@ -2507,6 +1981,304 @@
     </w:lvl>
   </w:abstractNum>
   <w:abstractNum w:abstractNumId="3" w15:restartNumberingAfterBreak="0">
+    <w:nsid w:val="09176136"/>
+    <w:multiLevelType w:val="multilevel"/>
+    <w:tmpl w:val="7C4014DA"/>
+    <w:lvl w:ilvl="0">
+      <w:start w:val="1"/>
+      <w:numFmt w:val="bullet"/>
+      <w:lvlText w:val=""/>
+      <w:lvlJc w:val="left"/>
+      <w:pPr>
+        <w:tabs>
+          <w:tab w:val="num" w:pos="720"/>
+        </w:tabs>
+        <w:ind w:left="720" w:hanging="360"/>
+      </w:pPr>
+      <w:rPr>
+        <w:rFonts w:ascii="Symbol" w:hAnsi="Symbol" w:hint="default"/>
+        <w:sz w:val="20"/>
+      </w:rPr>
+    </w:lvl>
+    <w:lvl w:ilvl="1">
+      <w:start w:val="1"/>
+      <w:numFmt w:val="bullet"/>
+      <w:lvlText w:val=""/>
+      <w:lvlJc w:val="left"/>
+      <w:pPr>
+        <w:tabs>
+          <w:tab w:val="num" w:pos="1440"/>
+        </w:tabs>
+        <w:ind w:left="1440" w:hanging="360"/>
+      </w:pPr>
+      <w:rPr>
+        <w:rFonts w:ascii="Symbol" w:hAnsi="Symbol" w:hint="default"/>
+        <w:sz w:val="20"/>
+      </w:rPr>
+    </w:lvl>
+    <w:lvl w:ilvl="2" w:tentative="1">
+      <w:start w:val="1"/>
+      <w:numFmt w:val="bullet"/>
+      <w:lvlText w:val=""/>
+      <w:lvlJc w:val="left"/>
+      <w:pPr>
+        <w:tabs>
+          <w:tab w:val="num" w:pos="2160"/>
+        </w:tabs>
+        <w:ind w:left="2160" w:hanging="360"/>
+      </w:pPr>
+      <w:rPr>
+        <w:rFonts w:ascii="Symbol" w:hAnsi="Symbol" w:hint="default"/>
+        <w:sz w:val="20"/>
+      </w:rPr>
+    </w:lvl>
+    <w:lvl w:ilvl="3" w:tentative="1">
+      <w:start w:val="1"/>
+      <w:numFmt w:val="bullet"/>
+      <w:lvlText w:val=""/>
+      <w:lvlJc w:val="left"/>
+      <w:pPr>
+        <w:tabs>
+          <w:tab w:val="num" w:pos="2880"/>
+        </w:tabs>
+        <w:ind w:left="2880" w:hanging="360"/>
+      </w:pPr>
+      <w:rPr>
+        <w:rFonts w:ascii="Symbol" w:hAnsi="Symbol" w:hint="default"/>
+        <w:sz w:val="20"/>
+      </w:rPr>
+    </w:lvl>
+    <w:lvl w:ilvl="4" w:tentative="1">
+      <w:start w:val="1"/>
+      <w:numFmt w:val="bullet"/>
+      <w:lvlText w:val=""/>
+      <w:lvlJc w:val="left"/>
+      <w:pPr>
+        <w:tabs>
+          <w:tab w:val="num" w:pos="3600"/>
+        </w:tabs>
+        <w:ind w:left="3600" w:hanging="360"/>
+      </w:pPr>
+      <w:rPr>
+        <w:rFonts w:ascii="Symbol" w:hAnsi="Symbol" w:hint="default"/>
+        <w:sz w:val="20"/>
+      </w:rPr>
+    </w:lvl>
+    <w:lvl w:ilvl="5" w:tentative="1">
+      <w:start w:val="1"/>
+      <w:numFmt w:val="bullet"/>
+      <w:lvlText w:val=""/>
+      <w:lvlJc w:val="left"/>
+      <w:pPr>
+        <w:tabs>
+          <w:tab w:val="num" w:pos="4320"/>
+        </w:tabs>
+        <w:ind w:left="4320" w:hanging="360"/>
+      </w:pPr>
+      <w:rPr>
+        <w:rFonts w:ascii="Symbol" w:hAnsi="Symbol" w:hint="default"/>
+        <w:sz w:val="20"/>
+      </w:rPr>
+    </w:lvl>
+    <w:lvl w:ilvl="6" w:tentative="1">
+      <w:start w:val="1"/>
+      <w:numFmt w:val="bullet"/>
+      <w:lvlText w:val=""/>
+      <w:lvlJc w:val="left"/>
+      <w:pPr>
+        <w:tabs>
+          <w:tab w:val="num" w:pos="5040"/>
+        </w:tabs>
+        <w:ind w:left="5040" w:hanging="360"/>
+      </w:pPr>
+      <w:rPr>
+        <w:rFonts w:ascii="Symbol" w:hAnsi="Symbol" w:hint="default"/>
+        <w:sz w:val="20"/>
+      </w:rPr>
+    </w:lvl>
+    <w:lvl w:ilvl="7" w:tentative="1">
+      <w:start w:val="1"/>
+      <w:numFmt w:val="bullet"/>
+      <w:lvlText w:val=""/>
+      <w:lvlJc w:val="left"/>
+      <w:pPr>
+        <w:tabs>
+          <w:tab w:val="num" w:pos="5760"/>
+        </w:tabs>
+        <w:ind w:left="5760" w:hanging="360"/>
+      </w:pPr>
+      <w:rPr>
+        <w:rFonts w:ascii="Symbol" w:hAnsi="Symbol" w:hint="default"/>
+        <w:sz w:val="20"/>
+      </w:rPr>
+    </w:lvl>
+    <w:lvl w:ilvl="8" w:tentative="1">
+      <w:start w:val="1"/>
+      <w:numFmt w:val="bullet"/>
+      <w:lvlText w:val=""/>
+      <w:lvlJc w:val="left"/>
+      <w:pPr>
+        <w:tabs>
+          <w:tab w:val="num" w:pos="6480"/>
+        </w:tabs>
+        <w:ind w:left="6480" w:hanging="360"/>
+      </w:pPr>
+      <w:rPr>
+        <w:rFonts w:ascii="Symbol" w:hAnsi="Symbol" w:hint="default"/>
+        <w:sz w:val="20"/>
+      </w:rPr>
+    </w:lvl>
+  </w:abstractNum>
+  <w:abstractNum w:abstractNumId="4" w15:restartNumberingAfterBreak="0">
+    <w:nsid w:val="0921604C"/>
+    <w:multiLevelType w:val="multilevel"/>
+    <w:tmpl w:val="7C4014DA"/>
+    <w:lvl w:ilvl="0">
+      <w:start w:val="1"/>
+      <w:numFmt w:val="bullet"/>
+      <w:lvlText w:val=""/>
+      <w:lvlJc w:val="left"/>
+      <w:pPr>
+        <w:tabs>
+          <w:tab w:val="num" w:pos="720"/>
+        </w:tabs>
+        <w:ind w:left="720" w:hanging="360"/>
+      </w:pPr>
+      <w:rPr>
+        <w:rFonts w:ascii="Symbol" w:hAnsi="Symbol" w:hint="default"/>
+        <w:sz w:val="20"/>
+      </w:rPr>
+    </w:lvl>
+    <w:lvl w:ilvl="1" w:tentative="1">
+      <w:start w:val="1"/>
+      <w:numFmt w:val="bullet"/>
+      <w:lvlText w:val=""/>
+      <w:lvlJc w:val="left"/>
+      <w:pPr>
+        <w:tabs>
+          <w:tab w:val="num" w:pos="1440"/>
+        </w:tabs>
+        <w:ind w:left="1440" w:hanging="360"/>
+      </w:pPr>
+      <w:rPr>
+        <w:rFonts w:ascii="Symbol" w:hAnsi="Symbol" w:hint="default"/>
+        <w:sz w:val="20"/>
+      </w:rPr>
+    </w:lvl>
+    <w:lvl w:ilvl="2" w:tentative="1">
+      <w:start w:val="1"/>
+      <w:numFmt w:val="bullet"/>
+      <w:lvlText w:val=""/>
+      <w:lvlJc w:val="left"/>
+      <w:pPr>
+        <w:tabs>
+          <w:tab w:val="num" w:pos="2160"/>
+        </w:tabs>
+        <w:ind w:left="2160" w:hanging="360"/>
+      </w:pPr>
+      <w:rPr>
+        <w:rFonts w:ascii="Symbol" w:hAnsi="Symbol" w:hint="default"/>
+        <w:sz w:val="20"/>
+      </w:rPr>
+    </w:lvl>
+    <w:lvl w:ilvl="3" w:tentative="1">
+      <w:start w:val="1"/>
+      <w:numFmt w:val="bullet"/>
+      <w:lvlText w:val=""/>
+      <w:lvlJc w:val="left"/>
+      <w:pPr>
+        <w:tabs>
+          <w:tab w:val="num" w:pos="2880"/>
+        </w:tabs>
+        <w:ind w:left="2880" w:hanging="360"/>
+      </w:pPr>
+      <w:rPr>
+        <w:rFonts w:ascii="Symbol" w:hAnsi="Symbol" w:hint="default"/>
+        <w:sz w:val="20"/>
+      </w:rPr>
+    </w:lvl>
+    <w:lvl w:ilvl="4" w:tentative="1">
+      <w:start w:val="1"/>
+      <w:numFmt w:val="bullet"/>
+      <w:lvlText w:val=""/>
+      <w:lvlJc w:val="left"/>
+      <w:pPr>
+        <w:tabs>
+          <w:tab w:val="num" w:pos="3600"/>
+        </w:tabs>
+        <w:ind w:left="3600" w:hanging="360"/>
+      </w:pPr>
+      <w:rPr>
+        <w:rFonts w:ascii="Symbol" w:hAnsi="Symbol" w:hint="default"/>
+        <w:sz w:val="20"/>
+      </w:rPr>
+    </w:lvl>
+    <w:lvl w:ilvl="5" w:tentative="1">
+      <w:start w:val="1"/>
+      <w:numFmt w:val="bullet"/>
+      <w:lvlText w:val=""/>
+      <w:lvlJc w:val="left"/>
+      <w:pPr>
+        <w:tabs>
+          <w:tab w:val="num" w:pos="4320"/>
+        </w:tabs>
+        <w:ind w:left="4320" w:hanging="360"/>
+      </w:pPr>
+      <w:rPr>
+        <w:rFonts w:ascii="Symbol" w:hAnsi="Symbol" w:hint="default"/>
+        <w:sz w:val="20"/>
+      </w:rPr>
+    </w:lvl>
+    <w:lvl w:ilvl="6" w:tentative="1">
+      <w:start w:val="1"/>
+      <w:numFmt w:val="bullet"/>
+      <w:lvlText w:val=""/>
+      <w:lvlJc w:val="left"/>
+      <w:pPr>
+        <w:tabs>
+          <w:tab w:val="num" w:pos="5040"/>
+        </w:tabs>
+        <w:ind w:left="5040" w:hanging="360"/>
+      </w:pPr>
+      <w:rPr>
+        <w:rFonts w:ascii="Symbol" w:hAnsi="Symbol" w:hint="default"/>
+        <w:sz w:val="20"/>
+      </w:rPr>
+    </w:lvl>
+    <w:lvl w:ilvl="7" w:tentative="1">
+      <w:start w:val="1"/>
+      <w:numFmt w:val="bullet"/>
+      <w:lvlText w:val=""/>
+      <w:lvlJc w:val="left"/>
+      <w:pPr>
+        <w:tabs>
+          <w:tab w:val="num" w:pos="5760"/>
+        </w:tabs>
+        <w:ind w:left="5760" w:hanging="360"/>
+      </w:pPr>
+      <w:rPr>
+        <w:rFonts w:ascii="Symbol" w:hAnsi="Symbol" w:hint="default"/>
+        <w:sz w:val="20"/>
+      </w:rPr>
+    </w:lvl>
+    <w:lvl w:ilvl="8" w:tentative="1">
+      <w:start w:val="1"/>
+      <w:numFmt w:val="bullet"/>
+      <w:lvlText w:val=""/>
+      <w:lvlJc w:val="left"/>
+      <w:pPr>
+        <w:tabs>
+          <w:tab w:val="num" w:pos="6480"/>
+        </w:tabs>
+        <w:ind w:left="6480" w:hanging="360"/>
+      </w:pPr>
+      <w:rPr>
+        <w:rFonts w:ascii="Symbol" w:hAnsi="Symbol" w:hint="default"/>
+        <w:sz w:val="20"/>
+      </w:rPr>
+    </w:lvl>
+  </w:abstractNum>
+  <w:abstractNum w:abstractNumId="5" w15:restartNumberingAfterBreak="0">
     <w:nsid w:val="12AE5E7E"/>
     <w:multiLevelType w:val="multilevel"/>
     <w:tmpl w:val="AB765AC2"/>
@@ -2655,7 +2427,156 @@
       </w:rPr>
     </w:lvl>
   </w:abstractNum>
-  <w:abstractNum w:abstractNumId="4" w15:restartNumberingAfterBreak="0">
+  <w:abstractNum w:abstractNumId="6" w15:restartNumberingAfterBreak="0">
+    <w:nsid w:val="149F3C00"/>
+    <w:multiLevelType w:val="multilevel"/>
+    <w:tmpl w:val="7C4014DA"/>
+    <w:lvl w:ilvl="0">
+      <w:start w:val="1"/>
+      <w:numFmt w:val="bullet"/>
+      <w:lvlText w:val=""/>
+      <w:lvlJc w:val="left"/>
+      <w:pPr>
+        <w:tabs>
+          <w:tab w:val="num" w:pos="720"/>
+        </w:tabs>
+        <w:ind w:left="720" w:hanging="360"/>
+      </w:pPr>
+      <w:rPr>
+        <w:rFonts w:ascii="Symbol" w:hAnsi="Symbol" w:hint="default"/>
+        <w:sz w:val="20"/>
+      </w:rPr>
+    </w:lvl>
+    <w:lvl w:ilvl="1" w:tentative="1">
+      <w:start w:val="1"/>
+      <w:numFmt w:val="bullet"/>
+      <w:lvlText w:val=""/>
+      <w:lvlJc w:val="left"/>
+      <w:pPr>
+        <w:tabs>
+          <w:tab w:val="num" w:pos="1440"/>
+        </w:tabs>
+        <w:ind w:left="1440" w:hanging="360"/>
+      </w:pPr>
+      <w:rPr>
+        <w:rFonts w:ascii="Symbol" w:hAnsi="Symbol" w:hint="default"/>
+        <w:sz w:val="20"/>
+      </w:rPr>
+    </w:lvl>
+    <w:lvl w:ilvl="2" w:tentative="1">
+      <w:start w:val="1"/>
+      <w:numFmt w:val="bullet"/>
+      <w:lvlText w:val=""/>
+      <w:lvlJc w:val="left"/>
+      <w:pPr>
+        <w:tabs>
+          <w:tab w:val="num" w:pos="2160"/>
+        </w:tabs>
+        <w:ind w:left="2160" w:hanging="360"/>
+      </w:pPr>
+      <w:rPr>
+        <w:rFonts w:ascii="Symbol" w:hAnsi="Symbol" w:hint="default"/>
+        <w:sz w:val="20"/>
+      </w:rPr>
+    </w:lvl>
+    <w:lvl w:ilvl="3" w:tentative="1">
+      <w:start w:val="1"/>
+      <w:numFmt w:val="bullet"/>
+      <w:lvlText w:val=""/>
+      <w:lvlJc w:val="left"/>
+      <w:pPr>
+        <w:tabs>
+          <w:tab w:val="num" w:pos="2880"/>
+        </w:tabs>
+        <w:ind w:left="2880" w:hanging="360"/>
+      </w:pPr>
+      <w:rPr>
+        <w:rFonts w:ascii="Symbol" w:hAnsi="Symbol" w:hint="default"/>
+        <w:sz w:val="20"/>
+      </w:rPr>
+    </w:lvl>
+    <w:lvl w:ilvl="4" w:tentative="1">
+      <w:start w:val="1"/>
+      <w:numFmt w:val="bullet"/>
+      <w:lvlText w:val=""/>
+      <w:lvlJc w:val="left"/>
+      <w:pPr>
+        <w:tabs>
+          <w:tab w:val="num" w:pos="3600"/>
+        </w:tabs>
+        <w:ind w:left="3600" w:hanging="360"/>
+      </w:pPr>
+      <w:rPr>
+        <w:rFonts w:ascii="Symbol" w:hAnsi="Symbol" w:hint="default"/>
+        <w:sz w:val="20"/>
+      </w:rPr>
+    </w:lvl>
+    <w:lvl w:ilvl="5" w:tentative="1">
+      <w:start w:val="1"/>
+      <w:numFmt w:val="bullet"/>
+      <w:lvlText w:val=""/>
+      <w:lvlJc w:val="left"/>
+      <w:pPr>
+        <w:tabs>
+          <w:tab w:val="num" w:pos="4320"/>
+        </w:tabs>
+        <w:ind w:left="4320" w:hanging="360"/>
+      </w:pPr>
+      <w:rPr>
+        <w:rFonts w:ascii="Symbol" w:hAnsi="Symbol" w:hint="default"/>
+        <w:sz w:val="20"/>
+      </w:rPr>
+    </w:lvl>
+    <w:lvl w:ilvl="6" w:tentative="1">
+      <w:start w:val="1"/>
+      <w:numFmt w:val="bullet"/>
+      <w:lvlText w:val=""/>
+      <w:lvlJc w:val="left"/>
+      <w:pPr>
+        <w:tabs>
+          <w:tab w:val="num" w:pos="5040"/>
+        </w:tabs>
+        <w:ind w:left="5040" w:hanging="360"/>
+      </w:pPr>
+      <w:rPr>
+        <w:rFonts w:ascii="Symbol" w:hAnsi="Symbol" w:hint="default"/>
+        <w:sz w:val="20"/>
+      </w:rPr>
+    </w:lvl>
+    <w:lvl w:ilvl="7" w:tentative="1">
+      <w:start w:val="1"/>
+      <w:numFmt w:val="bullet"/>
+      <w:lvlText w:val=""/>
+      <w:lvlJc w:val="left"/>
+      <w:pPr>
+        <w:tabs>
+          <w:tab w:val="num" w:pos="5760"/>
+        </w:tabs>
+        <w:ind w:left="5760" w:hanging="360"/>
+      </w:pPr>
+      <w:rPr>
+        <w:rFonts w:ascii="Symbol" w:hAnsi="Symbol" w:hint="default"/>
+        <w:sz w:val="20"/>
+      </w:rPr>
+    </w:lvl>
+    <w:lvl w:ilvl="8" w:tentative="1">
+      <w:start w:val="1"/>
+      <w:numFmt w:val="bullet"/>
+      <w:lvlText w:val=""/>
+      <w:lvlJc w:val="left"/>
+      <w:pPr>
+        <w:tabs>
+          <w:tab w:val="num" w:pos="6480"/>
+        </w:tabs>
+        <w:ind w:left="6480" w:hanging="360"/>
+      </w:pPr>
+      <w:rPr>
+        <w:rFonts w:ascii="Symbol" w:hAnsi="Symbol" w:hint="default"/>
+        <w:sz w:val="20"/>
+      </w:rPr>
+    </w:lvl>
+  </w:abstractNum>
+  <w:abstractNum w:abstractNumId="7" w15:restartNumberingAfterBreak="0">
     <w:nsid w:val="22D750F7"/>
     <w:multiLevelType w:val="multilevel"/>
     <w:tmpl w:val="BB180F1E"/>
@@ -2804,7 +2725,156 @@
       </w:rPr>
     </w:lvl>
   </w:abstractNum>
-  <w:abstractNum w:abstractNumId="5" w15:restartNumberingAfterBreak="0">
+  <w:abstractNum w:abstractNumId="8" w15:restartNumberingAfterBreak="0">
+    <w:nsid w:val="23AF3680"/>
+    <w:multiLevelType w:val="multilevel"/>
+    <w:tmpl w:val="7C4014DA"/>
+    <w:lvl w:ilvl="0">
+      <w:start w:val="1"/>
+      <w:numFmt w:val="bullet"/>
+      <w:lvlText w:val=""/>
+      <w:lvlJc w:val="left"/>
+      <w:pPr>
+        <w:tabs>
+          <w:tab w:val="num" w:pos="720"/>
+        </w:tabs>
+        <w:ind w:left="720" w:hanging="360"/>
+      </w:pPr>
+      <w:rPr>
+        <w:rFonts w:ascii="Symbol" w:hAnsi="Symbol" w:hint="default"/>
+        <w:sz w:val="20"/>
+      </w:rPr>
+    </w:lvl>
+    <w:lvl w:ilvl="1" w:tentative="1">
+      <w:start w:val="1"/>
+      <w:numFmt w:val="bullet"/>
+      <w:lvlText w:val=""/>
+      <w:lvlJc w:val="left"/>
+      <w:pPr>
+        <w:tabs>
+          <w:tab w:val="num" w:pos="1440"/>
+        </w:tabs>
+        <w:ind w:left="1440" w:hanging="360"/>
+      </w:pPr>
+      <w:rPr>
+        <w:rFonts w:ascii="Symbol" w:hAnsi="Symbol" w:hint="default"/>
+        <w:sz w:val="20"/>
+      </w:rPr>
+    </w:lvl>
+    <w:lvl w:ilvl="2" w:tentative="1">
+      <w:start w:val="1"/>
+      <w:numFmt w:val="bullet"/>
+      <w:lvlText w:val=""/>
+      <w:lvlJc w:val="left"/>
+      <w:pPr>
+        <w:tabs>
+          <w:tab w:val="num" w:pos="2160"/>
+        </w:tabs>
+        <w:ind w:left="2160" w:hanging="360"/>
+      </w:pPr>
+      <w:rPr>
+        <w:rFonts w:ascii="Symbol" w:hAnsi="Symbol" w:hint="default"/>
+        <w:sz w:val="20"/>
+      </w:rPr>
+    </w:lvl>
+    <w:lvl w:ilvl="3" w:tentative="1">
+      <w:start w:val="1"/>
+      <w:numFmt w:val="bullet"/>
+      <w:lvlText w:val=""/>
+      <w:lvlJc w:val="left"/>
+      <w:pPr>
+        <w:tabs>
+          <w:tab w:val="num" w:pos="2880"/>
+        </w:tabs>
+        <w:ind w:left="2880" w:hanging="360"/>
+      </w:pPr>
+      <w:rPr>
+        <w:rFonts w:ascii="Symbol" w:hAnsi="Symbol" w:hint="default"/>
+        <w:sz w:val="20"/>
+      </w:rPr>
+    </w:lvl>
+    <w:lvl w:ilvl="4" w:tentative="1">
+      <w:start w:val="1"/>
+      <w:numFmt w:val="bullet"/>
+      <w:lvlText w:val=""/>
+      <w:lvlJc w:val="left"/>
+      <w:pPr>
+        <w:tabs>
+          <w:tab w:val="num" w:pos="3600"/>
+        </w:tabs>
+        <w:ind w:left="3600" w:hanging="360"/>
+      </w:pPr>
+      <w:rPr>
+        <w:rFonts w:ascii="Symbol" w:hAnsi="Symbol" w:hint="default"/>
+        <w:sz w:val="20"/>
+      </w:rPr>
+    </w:lvl>
+    <w:lvl w:ilvl="5" w:tentative="1">
+      <w:start w:val="1"/>
+      <w:numFmt w:val="bullet"/>
+      <w:lvlText w:val=""/>
+      <w:lvlJc w:val="left"/>
+      <w:pPr>
+        <w:tabs>
+          <w:tab w:val="num" w:pos="4320"/>
+        </w:tabs>
+        <w:ind w:left="4320" w:hanging="360"/>
+      </w:pPr>
+      <w:rPr>
+        <w:rFonts w:ascii="Symbol" w:hAnsi="Symbol" w:hint="default"/>
+        <w:sz w:val="20"/>
+      </w:rPr>
+    </w:lvl>
+    <w:lvl w:ilvl="6" w:tentative="1">
+      <w:start w:val="1"/>
+      <w:numFmt w:val="bullet"/>
+      <w:lvlText w:val=""/>
+      <w:lvlJc w:val="left"/>
+      <w:pPr>
+        <w:tabs>
+          <w:tab w:val="num" w:pos="5040"/>
+        </w:tabs>
+        <w:ind w:left="5040" w:hanging="360"/>
+      </w:pPr>
+      <w:rPr>
+        <w:rFonts w:ascii="Symbol" w:hAnsi="Symbol" w:hint="default"/>
+        <w:sz w:val="20"/>
+      </w:rPr>
+    </w:lvl>
+    <w:lvl w:ilvl="7" w:tentative="1">
+      <w:start w:val="1"/>
+      <w:numFmt w:val="bullet"/>
+      <w:lvlText w:val=""/>
+      <w:lvlJc w:val="left"/>
+      <w:pPr>
+        <w:tabs>
+          <w:tab w:val="num" w:pos="5760"/>
+        </w:tabs>
+        <w:ind w:left="5760" w:hanging="360"/>
+      </w:pPr>
+      <w:rPr>
+        <w:rFonts w:ascii="Symbol" w:hAnsi="Symbol" w:hint="default"/>
+        <w:sz w:val="20"/>
+      </w:rPr>
+    </w:lvl>
+    <w:lvl w:ilvl="8" w:tentative="1">
+      <w:start w:val="1"/>
+      <w:numFmt w:val="bullet"/>
+      <w:lvlText w:val=""/>
+      <w:lvlJc w:val="left"/>
+      <w:pPr>
+        <w:tabs>
+          <w:tab w:val="num" w:pos="6480"/>
+        </w:tabs>
+        <w:ind w:left="6480" w:hanging="360"/>
+      </w:pPr>
+      <w:rPr>
+        <w:rFonts w:ascii="Symbol" w:hAnsi="Symbol" w:hint="default"/>
+        <w:sz w:val="20"/>
+      </w:rPr>
+    </w:lvl>
+  </w:abstractNum>
+  <w:abstractNum w:abstractNumId="9" w15:restartNumberingAfterBreak="0">
     <w:nsid w:val="38F146A5"/>
     <w:multiLevelType w:val="multilevel"/>
     <w:tmpl w:val="7C4014DA"/>
@@ -2953,7 +3023,7 @@
       </w:rPr>
     </w:lvl>
   </w:abstractNum>
-  <w:abstractNum w:abstractNumId="6" w15:restartNumberingAfterBreak="0">
+  <w:abstractNum w:abstractNumId="10" w15:restartNumberingAfterBreak="0">
     <w:nsid w:val="3F21216C"/>
     <w:multiLevelType w:val="multilevel"/>
     <w:tmpl w:val="EA30C14C"/>
@@ -3102,7 +3172,7 @@
       </w:rPr>
     </w:lvl>
   </w:abstractNum>
-  <w:abstractNum w:abstractNumId="7" w15:restartNumberingAfterBreak="0">
+  <w:abstractNum w:abstractNumId="11" w15:restartNumberingAfterBreak="0">
     <w:nsid w:val="487D224B"/>
     <w:multiLevelType w:val="multilevel"/>
     <w:tmpl w:val="7C4014DA"/>
@@ -3251,7 +3321,7 @@
       </w:rPr>
     </w:lvl>
   </w:abstractNum>
-  <w:abstractNum w:abstractNumId="8" w15:restartNumberingAfterBreak="0">
+  <w:abstractNum w:abstractNumId="12" w15:restartNumberingAfterBreak="0">
     <w:nsid w:val="4F693409"/>
     <w:multiLevelType w:val="multilevel"/>
     <w:tmpl w:val="DA6E5060"/>
@@ -3400,7 +3470,7 @@
       </w:rPr>
     </w:lvl>
   </w:abstractNum>
-  <w:abstractNum w:abstractNumId="9" w15:restartNumberingAfterBreak="0">
+  <w:abstractNum w:abstractNumId="13" w15:restartNumberingAfterBreak="0">
     <w:nsid w:val="4F6A66BD"/>
     <w:multiLevelType w:val="multilevel"/>
     <w:tmpl w:val="7C4014DA"/>
@@ -3549,7 +3619,7 @@
       </w:rPr>
     </w:lvl>
   </w:abstractNum>
-  <w:abstractNum w:abstractNumId="10" w15:restartNumberingAfterBreak="0">
+  <w:abstractNum w:abstractNumId="14" w15:restartNumberingAfterBreak="0">
     <w:nsid w:val="51F602FF"/>
     <w:multiLevelType w:val="multilevel"/>
     <w:tmpl w:val="7C4014DA"/>
@@ -3698,7 +3768,7 @@
       </w:rPr>
     </w:lvl>
   </w:abstractNum>
-  <w:abstractNum w:abstractNumId="11" w15:restartNumberingAfterBreak="0">
+  <w:abstractNum w:abstractNumId="15" w15:restartNumberingAfterBreak="0">
     <w:nsid w:val="52413EE9"/>
     <w:multiLevelType w:val="multilevel"/>
     <w:tmpl w:val="62B89298"/>
@@ -3847,7 +3917,7 @@
       </w:rPr>
     </w:lvl>
   </w:abstractNum>
-  <w:abstractNum w:abstractNumId="12" w15:restartNumberingAfterBreak="0">
+  <w:abstractNum w:abstractNumId="16" w15:restartNumberingAfterBreak="0">
     <w:nsid w:val="563C70FC"/>
     <w:multiLevelType w:val="multilevel"/>
     <w:tmpl w:val="7924F2BC"/>
@@ -3996,7 +4066,7 @@
       </w:rPr>
     </w:lvl>
   </w:abstractNum>
-  <w:abstractNum w:abstractNumId="13" w15:restartNumberingAfterBreak="0">
+  <w:abstractNum w:abstractNumId="17" w15:restartNumberingAfterBreak="0">
     <w:nsid w:val="603762FE"/>
     <w:multiLevelType w:val="multilevel"/>
     <w:tmpl w:val="D0B8CD88"/>
@@ -4145,7 +4215,7 @@
       </w:rPr>
     </w:lvl>
   </w:abstractNum>
-  <w:abstractNum w:abstractNumId="14" w15:restartNumberingAfterBreak="0">
+  <w:abstractNum w:abstractNumId="18" w15:restartNumberingAfterBreak="0">
     <w:nsid w:val="65472FF3"/>
     <w:multiLevelType w:val="multilevel"/>
     <w:tmpl w:val="898A0D4A"/>
@@ -4294,7 +4364,7 @@
       </w:rPr>
     </w:lvl>
   </w:abstractNum>
-  <w:abstractNum w:abstractNumId="15" w15:restartNumberingAfterBreak="0">
+  <w:abstractNum w:abstractNumId="19" w15:restartNumberingAfterBreak="0">
     <w:nsid w:val="6A046BA8"/>
     <w:multiLevelType w:val="multilevel"/>
     <w:tmpl w:val="D488F93E"/>
@@ -4443,7 +4513,7 @@
       </w:rPr>
     </w:lvl>
   </w:abstractNum>
-  <w:abstractNum w:abstractNumId="16" w15:restartNumberingAfterBreak="0">
+  <w:abstractNum w:abstractNumId="20" w15:restartNumberingAfterBreak="0">
     <w:nsid w:val="6F1E2CAA"/>
     <w:multiLevelType w:val="multilevel"/>
     <w:tmpl w:val="6748AB6A"/>
@@ -4592,7 +4662,7 @@
       </w:rPr>
     </w:lvl>
   </w:abstractNum>
-  <w:abstractNum w:abstractNumId="17" w15:restartNumberingAfterBreak="0">
+  <w:abstractNum w:abstractNumId="21" w15:restartNumberingAfterBreak="0">
     <w:nsid w:val="71923116"/>
     <w:multiLevelType w:val="multilevel"/>
     <w:tmpl w:val="9D624A9E"/>
@@ -4741,7 +4811,7 @@
       </w:rPr>
     </w:lvl>
   </w:abstractNum>
-  <w:abstractNum w:abstractNumId="18" w15:restartNumberingAfterBreak="0">
+  <w:abstractNum w:abstractNumId="22" w15:restartNumberingAfterBreak="0">
     <w:nsid w:val="744665FC"/>
     <w:multiLevelType w:val="multilevel"/>
     <w:tmpl w:val="9DC07CFC"/>
@@ -4894,58 +4964,70 @@
     <w:abstractNumId w:val="0"/>
   </w:num>
   <w:num w:numId="2" w16cid:durableId="547374407">
+    <w:abstractNumId w:val="19"/>
+  </w:num>
+  <w:num w:numId="3" w16cid:durableId="2013950899">
+    <w:abstractNumId w:val="21"/>
+  </w:num>
+  <w:num w:numId="4" w16cid:durableId="1412041240">
+    <w:abstractNumId w:val="20"/>
+  </w:num>
+  <w:num w:numId="5" w16cid:durableId="1289167835">
+    <w:abstractNumId w:val="17"/>
+  </w:num>
+  <w:num w:numId="6" w16cid:durableId="701133459">
     <w:abstractNumId w:val="15"/>
   </w:num>
-  <w:num w:numId="3" w16cid:durableId="2013950899">
-    <w:abstractNumId w:val="17"/>
+  <w:num w:numId="7" w16cid:durableId="1949851959">
+    <w:abstractNumId w:val="12"/>
   </w:num>
-  <w:num w:numId="4" w16cid:durableId="1412041240">
-    <w:abstractNumId w:val="16"/>
+  <w:num w:numId="8" w16cid:durableId="441614104">
+    <w:abstractNumId w:val="10"/>
   </w:num>
-  <w:num w:numId="5" w16cid:durableId="1289167835">
-    <w:abstractNumId w:val="13"/>
+  <w:num w:numId="9" w16cid:durableId="685056100">
+    <w:abstractNumId w:val="7"/>
   </w:num>
-  <w:num w:numId="6" w16cid:durableId="701133459">
+  <w:num w:numId="10" w16cid:durableId="267934937">
+    <w:abstractNumId w:val="18"/>
+  </w:num>
+  <w:num w:numId="11" w16cid:durableId="850532279">
     <w:abstractNumId w:val="11"/>
   </w:num>
-  <w:num w:numId="7" w16cid:durableId="1949851959">
-    <w:abstractNumId w:val="8"/>
-  </w:num>
-  <w:num w:numId="8" w16cid:durableId="441614104">
-    <w:abstractNumId w:val="6"/>
-  </w:num>
-  <w:num w:numId="9" w16cid:durableId="685056100">
-    <w:abstractNumId w:val="4"/>
-  </w:num>
-  <w:num w:numId="10" w16cid:durableId="267934937">
-    <w:abstractNumId w:val="14"/>
-  </w:num>
-  <w:num w:numId="11" w16cid:durableId="850532279">
-    <w:abstractNumId w:val="7"/>
-  </w:num>
   <w:num w:numId="12" w16cid:durableId="377050821">
-    <w:abstractNumId w:val="18"/>
+    <w:abstractNumId w:val="22"/>
   </w:num>
   <w:num w:numId="13" w16cid:durableId="430400013">
-    <w:abstractNumId w:val="3"/>
+    <w:abstractNumId w:val="5"/>
   </w:num>
   <w:num w:numId="14" w16cid:durableId="1707292571">
-    <w:abstractNumId w:val="12"/>
+    <w:abstractNumId w:val="16"/>
   </w:num>
   <w:num w:numId="15" w16cid:durableId="654139216">
     <w:abstractNumId w:val="2"/>
   </w:num>
   <w:num w:numId="16" w16cid:durableId="699622866">
-    <w:abstractNumId w:val="9"/>
+    <w:abstractNumId w:val="13"/>
   </w:num>
   <w:num w:numId="17" w16cid:durableId="303320056">
     <w:abstractNumId w:val="1"/>
   </w:num>
   <w:num w:numId="18" w16cid:durableId="1769810651">
-    <w:abstractNumId w:val="5"/>
+    <w:abstractNumId w:val="9"/>
   </w:num>
   <w:num w:numId="19" w16cid:durableId="774906393">
-    <w:abstractNumId w:val="10"/>
+    <w:abstractNumId w:val="14"/>
+  </w:num>
+  <w:num w:numId="20" w16cid:durableId="119157640">
+    <w:abstractNumId w:val="8"/>
+  </w:num>
+  <w:num w:numId="21" w16cid:durableId="499154031">
+    <w:abstractNumId w:val="6"/>
+  </w:num>
+  <w:num w:numId="22" w16cid:durableId="568154885">
+    <w:abstractNumId w:val="4"/>
+  </w:num>
+  <w:num w:numId="23" w16cid:durableId="814298673">
+    <w:abstractNumId w:val="3"/>
   </w:num>
 </w:numbering>
 </file>

</xml_diff>

<commit_message>
add prd document and formatting guidelines
</commit_message>
<xml_diff>
--- a/docs/Brainstorm_Features.docx
+++ b/docs/Brainstorm_Features.docx
@@ -20,7 +20,33 @@
         <w:rPr>
           <w:rFonts w:ascii="Calibri" w:eastAsia="Times New Roman" w:hAnsi="Calibri" w:cs="Calibri"/>
         </w:rPr>
-        <w:t xml:space="preserve">: Many apps and websites are designed to capture and retain your attention, and this can lead to severe phone and internet addiction, drive negative procrastination behavioral feedback loops, and ruin work habits. This is particularly harmful for remote workers and neurodiverse individuals, such as those with ADHD. A vast majority of Gen Z will admit that they spend far too much time on their phone or computer unproductively, and they hate that they are doing it, but they can't help it. There are services that exist to block apps or websites, but these don't tackle the root issues of internet addiction. Other services exist to help track tasks/goals, or help with time management, but most of these are passive apps that aren't actively reviewing what you are doing and assisting you along the way. </w:t>
+        <w:t xml:space="preserve">: Many apps and websites are </w:t>
+      </w:r>
+      <w:r>
+        <w:rPr>
+          <w:rFonts w:ascii="Calibri" w:eastAsia="Times New Roman" w:hAnsi="Calibri" w:cs="Calibri"/>
+        </w:rPr>
+        <w:t>d</w:t>
+      </w:r>
+      <w:r>
+        <w:rPr>
+          <w:rFonts w:ascii="Calibri" w:eastAsia="Times New Roman" w:hAnsi="Calibri" w:cs="Calibri"/>
+        </w:rPr>
+        <w:t xml:space="preserve">esigned to capture and retain your attention, and this can lead to severe phone and internet addiction, drive negative procrastination behavioral feedback loops, and ruin work habits. This is particularly harmful for remote workers and neurodiverse individuals, such as those with ADHD. </w:t>
+      </w:r>
+      <w:proofErr w:type="gramStart"/>
+      <w:r>
+        <w:rPr>
+          <w:rFonts w:ascii="Calibri" w:eastAsia="Times New Roman" w:hAnsi="Calibri" w:cs="Calibri"/>
+        </w:rPr>
+        <w:t>A vast</w:t>
+      </w:r>
+      <w:proofErr w:type="gramEnd"/>
+      <w:r>
+        <w:rPr>
+          <w:rFonts w:ascii="Calibri" w:eastAsia="Times New Roman" w:hAnsi="Calibri" w:cs="Calibri"/>
+        </w:rPr>
+        <w:t xml:space="preserve"> majority of Gen Z will admit that they spend far too much time on their phone or computer unproductively, and they hate that they are doing it, but they can't help it. There are services that exist to block apps or websites, but these don't tackle the root issues of internet addiction. Other services exist to help track tasks/goals, or help with time management, but most of these are passive apps that aren't actively reviewing what you are doing and assisting you along the way. </w:t>
       </w:r>
     </w:p>
     <w:p>
@@ -80,7 +106,35 @@
         <w:rPr>
           <w:rFonts w:ascii="Calibri" w:eastAsia="Times New Roman" w:hAnsi="Calibri" w:cs="Calibri"/>
         </w:rPr>
-        <w:t>: An empathy-oriented productivity app called "Momentum" that monitors my time spent on specific apps or websites and prompts me with CBT Thought Records to force me to analyze and create logs for why I am procrastinating. Based on my response, it will give me advice for how to stop avoiding what I am doing and how I can get started with actionable steps. It will give me tips to achieve longer, sustained focus, and will hold me accountable to them. Finally, it will help with organizing weekly tasks, daily task breakdown, and long term goal tracking.</w:t>
+        <w:t xml:space="preserve">: An empathy-oriented productivity app called "Momentum" that monitors my time spent on specific apps or websites and prompts me with CBT Thought Records to force me to analyze and create logs for why I am procrastinating. Based on my response, it will give me advice </w:t>
+      </w:r>
+      <w:proofErr w:type="gramStart"/>
+      <w:r>
+        <w:rPr>
+          <w:rFonts w:ascii="Calibri" w:eastAsia="Times New Roman" w:hAnsi="Calibri" w:cs="Calibri"/>
+        </w:rPr>
+        <w:t>for</w:t>
+      </w:r>
+      <w:proofErr w:type="gramEnd"/>
+      <w:r>
+        <w:rPr>
+          <w:rFonts w:ascii="Calibri" w:eastAsia="Times New Roman" w:hAnsi="Calibri" w:cs="Calibri"/>
+        </w:rPr>
+        <w:t xml:space="preserve"> how to stop avoiding what I am doing and how I can get started with actionable steps. It will give me tips to achieve longer, sustained focus, and will hold me accountable to them. Finally, it will help with organizing weekly tasks, daily task breakdown, and </w:t>
+      </w:r>
+      <w:proofErr w:type="gramStart"/>
+      <w:r>
+        <w:rPr>
+          <w:rFonts w:ascii="Calibri" w:eastAsia="Times New Roman" w:hAnsi="Calibri" w:cs="Calibri"/>
+        </w:rPr>
+        <w:t>long term</w:t>
+      </w:r>
+      <w:proofErr w:type="gramEnd"/>
+      <w:r>
+        <w:rPr>
+          <w:rFonts w:ascii="Calibri" w:eastAsia="Times New Roman" w:hAnsi="Calibri" w:cs="Calibri"/>
+        </w:rPr>
+        <w:t xml:space="preserve"> goal tracking.</w:t>
       </w:r>
     </w:p>
     <w:p>
@@ -160,7 +214,21 @@
         <w:rPr>
           <w:rFonts w:ascii="Calibri" w:eastAsia="Times New Roman" w:hAnsi="Calibri" w:cs="Calibri"/>
         </w:rPr>
-        <w:t>: This page prompts you to input all the tasks you need to complete this week. It forces you to consider what is only necessary for this week and allows you the option to push unessential items to next week's list. The app saves the list for each week in the current week of the Calendar page. Upon completion of the weekly tasks, the user can press the "Select Today's Tasks" button that allows users to choose which items from the weekly list they want to add to the Daily Task list. Once the user has finished adding to the daily list, the app will switch from the Weekly Task page to the Daily Task page.</w:t>
+        <w:t xml:space="preserve">: This page prompts you to input all the tasks you need to complete this week. It forces you to consider what is only necessary for this week and allows you the option to push unessential items to next week's list. The app saves the list for each week in the current week of the Calendar page. Upon completion of the weekly tasks, the user can press the "Select Today's Tasks" button that allows users to choose which items from the weekly list they want to add to the Daily Task list. Once the user has finished </w:t>
+      </w:r>
+      <w:proofErr w:type="gramStart"/>
+      <w:r>
+        <w:rPr>
+          <w:rFonts w:ascii="Calibri" w:eastAsia="Times New Roman" w:hAnsi="Calibri" w:cs="Calibri"/>
+        </w:rPr>
+        <w:t>adding</w:t>
+      </w:r>
+      <w:proofErr w:type="gramEnd"/>
+      <w:r>
+        <w:rPr>
+          <w:rFonts w:ascii="Calibri" w:eastAsia="Times New Roman" w:hAnsi="Calibri" w:cs="Calibri"/>
+        </w:rPr>
+        <w:t xml:space="preserve"> to the daily list, the app will switch from the Weekly Task page to the Daily Task page.</w:t>
       </w:r>
     </w:p>
     <w:p>
@@ -213,7 +281,35 @@
         <w:rPr>
           <w:rFonts w:ascii="Calibri" w:eastAsia="Times New Roman" w:hAnsi="Calibri" w:cs="Calibri"/>
         </w:rPr>
-        <w:t>: The calendar is viewable by day or week, and shows the daily or weekly tasks respectively. It saves data from previous days and weeks so users can see what they need to do this week and what they've accomplished in previous weeks. It shows the next weeks tasks that were deemed unnecessary from the current week's list. It lists goal milestones from the Goal Tracking page.</w:t>
+        <w:t xml:space="preserve">: The calendar is viewable by day or </w:t>
+      </w:r>
+      <w:proofErr w:type="gramStart"/>
+      <w:r>
+        <w:rPr>
+          <w:rFonts w:ascii="Calibri" w:eastAsia="Times New Roman" w:hAnsi="Calibri" w:cs="Calibri"/>
+        </w:rPr>
+        <w:t>week, and</w:t>
+      </w:r>
+      <w:proofErr w:type="gramEnd"/>
+      <w:r>
+        <w:rPr>
+          <w:rFonts w:ascii="Calibri" w:eastAsia="Times New Roman" w:hAnsi="Calibri" w:cs="Calibri"/>
+        </w:rPr>
+        <w:t xml:space="preserve"> shows the daily or weekly tasks respectively. It saves data from previous days and weeks so users can see what they need to do this week and what they've accomplished in previous weeks. It shows </w:t>
+      </w:r>
+      <w:proofErr w:type="gramStart"/>
+      <w:r>
+        <w:rPr>
+          <w:rFonts w:ascii="Calibri" w:eastAsia="Times New Roman" w:hAnsi="Calibri" w:cs="Calibri"/>
+        </w:rPr>
+        <w:t>the next weeks</w:t>
+      </w:r>
+      <w:proofErr w:type="gramEnd"/>
+      <w:r>
+        <w:rPr>
+          <w:rFonts w:ascii="Calibri" w:eastAsia="Times New Roman" w:hAnsi="Calibri" w:cs="Calibri"/>
+        </w:rPr>
+        <w:t xml:space="preserve"> tasks that were deemed unnecessary from the current week's list. It lists goal milestones from the Goal Tracking page.</w:t>
       </w:r>
     </w:p>
     <w:p>
@@ -239,7 +335,21 @@
         <w:rPr>
           <w:rFonts w:ascii="Calibri" w:eastAsia="Times New Roman" w:hAnsi="Calibri" w:cs="Calibri"/>
         </w:rPr>
-        <w:t>: This page allows users to add or delete any websites or apps that they want or don't want to allow. This is a global setting and this list should apply to any task by default. Individual tasks have the option to overwrite this feature. Global Strict Mode setting is here, which can be overwritten by the Strict Mode setting in the task view.</w:t>
+        <w:t xml:space="preserve">: This page allows users to add or delete any websites or apps that they want or don't want to allow. This is a global </w:t>
+      </w:r>
+      <w:proofErr w:type="gramStart"/>
+      <w:r>
+        <w:rPr>
+          <w:rFonts w:ascii="Calibri" w:eastAsia="Times New Roman" w:hAnsi="Calibri" w:cs="Calibri"/>
+        </w:rPr>
+        <w:t>setting</w:t>
+      </w:r>
+      <w:proofErr w:type="gramEnd"/>
+      <w:r>
+        <w:rPr>
+          <w:rFonts w:ascii="Calibri" w:eastAsia="Times New Roman" w:hAnsi="Calibri" w:cs="Calibri"/>
+        </w:rPr>
+        <w:t xml:space="preserve"> and this list should apply to any task by default. Individual tasks have the option to overwrite this feature. Global Strict Mode setting is here, which can be overwritten by the Strict Mode setting in the task view.</w:t>
       </w:r>
     </w:p>
     <w:p>
@@ -291,7 +401,21 @@
         <w:rPr>
           <w:rFonts w:ascii="Calibri" w:eastAsia="Times New Roman" w:hAnsi="Calibri" w:cs="Calibri"/>
         </w:rPr>
-        <w:t>landing page to view all previous Procrastination Logs that are saved as DD/MM/YY hh:mm. User can manually add a log here.</w:t>
+        <w:t xml:space="preserve">landing page to view all previous Procrastination Logs that are saved as DD/MM/YY </w:t>
+      </w:r>
+      <w:proofErr w:type="gramStart"/>
+      <w:r>
+        <w:rPr>
+          <w:rFonts w:ascii="Calibri" w:eastAsia="Times New Roman" w:hAnsi="Calibri" w:cs="Calibri"/>
+        </w:rPr>
+        <w:t>hh:mm.</w:t>
+      </w:r>
+      <w:proofErr w:type="gramEnd"/>
+      <w:r>
+        <w:rPr>
+          <w:rFonts w:ascii="Calibri" w:eastAsia="Times New Roman" w:hAnsi="Calibri" w:cs="Calibri"/>
+        </w:rPr>
+        <w:t xml:space="preserve"> User can manually add a log here.</w:t>
       </w:r>
     </w:p>
     <w:p>
@@ -345,7 +469,21 @@
         <w:rPr>
           <w:rFonts w:ascii="Calibri" w:eastAsia="Times New Roman" w:hAnsi="Calibri" w:cs="Calibri"/>
         </w:rPr>
-        <w:t xml:space="preserve">Current day, past days, and weekly/monthly trends as a bar graph with each bar the sum of the 3 data types (productive, unproductive, not-sure). </w:t>
+        <w:t xml:space="preserve">Current day, past days, and weekly/monthly trends as a bar graph with each bar the sum of the 3 data types (productive, unproductive, </w:t>
+      </w:r>
+      <w:proofErr w:type="gramStart"/>
+      <w:r>
+        <w:rPr>
+          <w:rFonts w:ascii="Calibri" w:eastAsia="Times New Roman" w:hAnsi="Calibri" w:cs="Calibri"/>
+        </w:rPr>
+        <w:t>not-sure</w:t>
+      </w:r>
+      <w:proofErr w:type="gramEnd"/>
+      <w:r>
+        <w:rPr>
+          <w:rFonts w:ascii="Calibri" w:eastAsia="Times New Roman" w:hAnsi="Calibri" w:cs="Calibri"/>
+        </w:rPr>
+        <w:t xml:space="preserve">). </w:t>
       </w:r>
     </w:p>
     <w:p>
@@ -371,7 +509,35 @@
         <w:rPr>
           <w:rFonts w:ascii="Calibri" w:eastAsia="Times New Roman" w:hAnsi="Calibri" w:cs="Calibri"/>
         </w:rPr>
-        <w:t xml:space="preserve"> Shows total minutes productive vs unproductive vs not-sure for the current live session. Ability to set a timer or Pomodoro Timer here. If Pomodoro Timer is enabled, this view shows the live timer counting up.</w:t>
+        <w:t xml:space="preserve"> Shows total minutes productive vs unproductive vs </w:t>
+      </w:r>
+      <w:proofErr w:type="gramStart"/>
+      <w:r>
+        <w:rPr>
+          <w:rFonts w:ascii="Calibri" w:eastAsia="Times New Roman" w:hAnsi="Calibri" w:cs="Calibri"/>
+        </w:rPr>
+        <w:t>not-sure</w:t>
+      </w:r>
+      <w:proofErr w:type="gramEnd"/>
+      <w:r>
+        <w:rPr>
+          <w:rFonts w:ascii="Calibri" w:eastAsia="Times New Roman" w:hAnsi="Calibri" w:cs="Calibri"/>
+        </w:rPr>
+        <w:t xml:space="preserve"> for the current live session. Ability to set a timer or Pomodoro Timer here. If Pomodoro Timer is enabled, this view shows the live timer </w:t>
+      </w:r>
+      <w:proofErr w:type="gramStart"/>
+      <w:r>
+        <w:rPr>
+          <w:rFonts w:ascii="Calibri" w:eastAsia="Times New Roman" w:hAnsi="Calibri" w:cs="Calibri"/>
+        </w:rPr>
+        <w:t>counting up</w:t>
+      </w:r>
+      <w:proofErr w:type="gramEnd"/>
+      <w:r>
+        <w:rPr>
+          <w:rFonts w:ascii="Calibri" w:eastAsia="Times New Roman" w:hAnsi="Calibri" w:cs="Calibri"/>
+        </w:rPr>
+        <w:t>.</w:t>
       </w:r>
     </w:p>
     <w:p>
@@ -621,11 +787,19 @@
         </w:rPr>
         <w:t>"Feeling Distracted?" Popup page</w:t>
       </w:r>
-      <w:r>
-        <w:rPr>
-          <w:rFonts w:ascii="Calibri" w:eastAsia="Times New Roman" w:hAnsi="Calibri" w:cs="Calibri"/>
-        </w:rPr>
-        <w:t>:  Appears after user accumulates 2 minutes of unproductive data, or 5 minutes of not-sure data. These minimums are configurable in Settings. This forces a windows notification. The popup offers the option for the user to "View risk factors that might be amplifying my emotions or harming focus" leading to Risk Factors page, or to "Try a Procrastination Log" leading to Procrastination Logs page (not the full Procrastination Logs landing page)</w:t>
+      <w:proofErr w:type="gramStart"/>
+      <w:r>
+        <w:rPr>
+          <w:rFonts w:ascii="Calibri" w:eastAsia="Times New Roman" w:hAnsi="Calibri" w:cs="Calibri"/>
+        </w:rPr>
+        <w:t>:  Appears</w:t>
+      </w:r>
+      <w:proofErr w:type="gramEnd"/>
+      <w:r>
+        <w:rPr>
+          <w:rFonts w:ascii="Calibri" w:eastAsia="Times New Roman" w:hAnsi="Calibri" w:cs="Calibri"/>
+        </w:rPr>
+        <w:t xml:space="preserve"> after user accumulates 2 minutes of unproductive data, or 5 minutes of not-sure data. These minimums are configurable in Settings. This forces a windows notification. The popup offers the option for the user to "View risk factors that might be amplifying my emotions or harming focus" leading to Risk Factors page, or to "Try a Procrastination Log" leading to Procrastination Logs page (not the full Procrastination Logs landing page)</w:t>
       </w:r>
     </w:p>
     <w:p>
@@ -643,7 +817,21 @@
         <w:rPr>
           <w:rFonts w:ascii="Calibri" w:eastAsia="Times New Roman" w:hAnsi="Calibri" w:cs="Calibri"/>
         </w:rPr>
-        <w:t xml:space="preserve">Procrastination Logs: See template in Momentum Log Templates.xlsx, "start a 10 minute timer" button   </w:t>
+        <w:t xml:space="preserve">Procrastination Logs: See template in Momentum Log Templates.xlsx, "start a </w:t>
+      </w:r>
+      <w:proofErr w:type="gramStart"/>
+      <w:r>
+        <w:rPr>
+          <w:rFonts w:ascii="Calibri" w:eastAsia="Times New Roman" w:hAnsi="Calibri" w:cs="Calibri"/>
+        </w:rPr>
+        <w:t>10 minute</w:t>
+      </w:r>
+      <w:proofErr w:type="gramEnd"/>
+      <w:r>
+        <w:rPr>
+          <w:rFonts w:ascii="Calibri" w:eastAsia="Times New Roman" w:hAnsi="Calibri" w:cs="Calibri"/>
+        </w:rPr>
+        <w:t xml:space="preserve"> timer" button   </w:t>
       </w:r>
     </w:p>
     <w:p>
@@ -669,7 +857,63 @@
         <w:rPr>
           <w:rFonts w:ascii="Calibri" w:eastAsia="Times New Roman" w:hAnsi="Calibri" w:cs="Calibri"/>
         </w:rPr>
-        <w:t>: User selects from a list of potential risk factors that lead to stronger emotions or decreased focus, and there is an option to write their own risk factors. Options include "Have I been eating consistently?", "Have I been drinking enough water?", "Have I been drinking more alcohol than usual?", "Have I been using any other substances?", "Have I been taking my medication as prescribed", "Have I been sleeping enough", "Have I exercised this week?", "Have I done any fun activities this week?", "Have I connected with a person I care about this week?", "Have I gone outside today?", "Have I done something that makes me feel accomplished or proud of myself this week?". After selecting the risk factor that the user experienced, they can create a task for the day to take action against that risk factor. This will be automatically set to reoccur daily for the next 2 weeks. Also after selecting the risk factor, a procrastination log is also created but are formatted differently as "Procrastination - DD/MM/YY hh:mm - lack of &lt;risk factor&gt;", and are saved to the Procrastination Logs landing page.</w:t>
+        <w:t xml:space="preserve">: User selects from a list of potential risk factors that lead to stronger emotions or decreased focus, and there is an option to write their own risk factors. Options include "Have I been eating consistently?", "Have I been drinking enough water?", "Have I been drinking more alcohol than usual?", "Have I been using any other substances?", "Have I been taking my medication as prescribed", "Have I been sleeping enough", "Have I exercised this week?", "Have I done any fun activities this week?", "Have I connected with a person I care about this week?", "Have I gone outside today?", "Have I done something that makes me feel accomplished or proud of myself this week?". After selecting the risk factor that the user experienced, they can create a task for the day to </w:t>
+      </w:r>
+      <w:proofErr w:type="gramStart"/>
+      <w:r>
+        <w:rPr>
+          <w:rFonts w:ascii="Calibri" w:eastAsia="Times New Roman" w:hAnsi="Calibri" w:cs="Calibri"/>
+        </w:rPr>
+        <w:t>take action</w:t>
+      </w:r>
+      <w:proofErr w:type="gramEnd"/>
+      <w:r>
+        <w:rPr>
+          <w:rFonts w:ascii="Calibri" w:eastAsia="Times New Roman" w:hAnsi="Calibri" w:cs="Calibri"/>
+        </w:rPr>
+        <w:t xml:space="preserve"> against that risk factor. This will be automatically set to </w:t>
+      </w:r>
+      <w:proofErr w:type="gramStart"/>
+      <w:r>
+        <w:rPr>
+          <w:rFonts w:ascii="Calibri" w:eastAsia="Times New Roman" w:hAnsi="Calibri" w:cs="Calibri"/>
+        </w:rPr>
+        <w:t>reoccur</w:t>
+      </w:r>
+      <w:proofErr w:type="gramEnd"/>
+      <w:r>
+        <w:rPr>
+          <w:rFonts w:ascii="Calibri" w:eastAsia="Times New Roman" w:hAnsi="Calibri" w:cs="Calibri"/>
+        </w:rPr>
+        <w:t xml:space="preserve"> daily for the next 2 weeks. </w:t>
+      </w:r>
+      <w:proofErr w:type="gramStart"/>
+      <w:r>
+        <w:rPr>
+          <w:rFonts w:ascii="Calibri" w:eastAsia="Times New Roman" w:hAnsi="Calibri" w:cs="Calibri"/>
+        </w:rPr>
+        <w:t>Also</w:t>
+      </w:r>
+      <w:proofErr w:type="gramEnd"/>
+      <w:r>
+        <w:rPr>
+          <w:rFonts w:ascii="Calibri" w:eastAsia="Times New Roman" w:hAnsi="Calibri" w:cs="Calibri"/>
+        </w:rPr>
+        <w:t xml:space="preserve"> after selecting the risk factor, a procrastination log is also created but are formatted differently as "Procrastination - DD/MM/YY hh:mm - lack of &lt;risk factor&gt;</w:t>
+      </w:r>
+      <w:proofErr w:type="gramStart"/>
+      <w:r>
+        <w:rPr>
+          <w:rFonts w:ascii="Calibri" w:eastAsia="Times New Roman" w:hAnsi="Calibri" w:cs="Calibri"/>
+        </w:rPr>
+        <w:t>", and</w:t>
+      </w:r>
+      <w:proofErr w:type="gramEnd"/>
+      <w:r>
+        <w:rPr>
+          <w:rFonts w:ascii="Calibri" w:eastAsia="Times New Roman" w:hAnsi="Calibri" w:cs="Calibri"/>
+        </w:rPr>
+        <w:t xml:space="preserve"> are saved to the Procrastination Logs landing page.</w:t>
       </w:r>
     </w:p>
     <w:p>
@@ -683,13 +927,23 @@
           <w:rFonts w:ascii="Calibri" w:eastAsia="Times New Roman" w:hAnsi="Calibri" w:cs="Calibri"/>
         </w:rPr>
       </w:pPr>
+      <w:proofErr w:type="gramStart"/>
       <w:r>
         <w:rPr>
           <w:rFonts w:ascii="Calibri" w:eastAsia="Times New Roman" w:hAnsi="Calibri" w:cs="Calibri"/>
           <w:b/>
           <w:bCs/>
         </w:rPr>
-        <w:t>Timers page</w:t>
+        <w:t>Timers</w:t>
+      </w:r>
+      <w:proofErr w:type="gramEnd"/>
+      <w:r>
+        <w:rPr>
+          <w:rFonts w:ascii="Calibri" w:eastAsia="Times New Roman" w:hAnsi="Calibri" w:cs="Calibri"/>
+          <w:b/>
+          <w:bCs/>
+        </w:rPr>
+        <w:t xml:space="preserve"> page</w:t>
       </w:r>
       <w:r>
         <w:rPr>
@@ -721,7 +975,35 @@
         <w:rPr>
           <w:rFonts w:ascii="Calibri" w:eastAsia="Times New Roman" w:hAnsi="Calibri" w:cs="Calibri"/>
         </w:rPr>
-        <w:t>: timer incrementing from 0 following the Pomodoro method of 25 minutes of working with a 5 minutes break. Other options for 50/10 split, or a custom split. The timer only increments with productive data. The break notifier pops up when they reach their productive target minutes, specifying how many break minutes they've earned. After finishing their break, it should prompt the user to start the pomodoro timer again, encouraging their hard work. When the user completes their 2nd consecutive pomodoro timers, the break amount should double, suggesting they've earned a longer break. This should continue for every other consecutive pomodoro timers started.</w:t>
+        <w:t xml:space="preserve">: timer incrementing from 0 following the Pomodoro method of 25 minutes of working with a 5 </w:t>
+      </w:r>
+      <w:proofErr w:type="gramStart"/>
+      <w:r>
+        <w:rPr>
+          <w:rFonts w:ascii="Calibri" w:eastAsia="Times New Roman" w:hAnsi="Calibri" w:cs="Calibri"/>
+        </w:rPr>
+        <w:t>minutes</w:t>
+      </w:r>
+      <w:proofErr w:type="gramEnd"/>
+      <w:r>
+        <w:rPr>
+          <w:rFonts w:ascii="Calibri" w:eastAsia="Times New Roman" w:hAnsi="Calibri" w:cs="Calibri"/>
+        </w:rPr>
+        <w:t xml:space="preserve"> break. Other options for 50/10 split, or a custom split. The timer only </w:t>
+      </w:r>
+      <w:proofErr w:type="gramStart"/>
+      <w:r>
+        <w:rPr>
+          <w:rFonts w:ascii="Calibri" w:eastAsia="Times New Roman" w:hAnsi="Calibri" w:cs="Calibri"/>
+        </w:rPr>
+        <w:t>increments</w:t>
+      </w:r>
+      <w:proofErr w:type="gramEnd"/>
+      <w:r>
+        <w:rPr>
+          <w:rFonts w:ascii="Calibri" w:eastAsia="Times New Roman" w:hAnsi="Calibri" w:cs="Calibri"/>
+        </w:rPr>
+        <w:t xml:space="preserve"> with productive data. The break notifier pops up when they reach their productive target minutes, specifying how many break minutes they've earned. After finishing their break, it should prompt the user to start the pomodoro timer again, encouraging their hard work. When the user completes their 2nd consecutive pomodoro timers, the break amount should double, suggesting they've earned a longer break. This should continue for every other consecutive pomodoro timers started.</w:t>
       </w:r>
     </w:p>
     <w:p>
@@ -795,7 +1077,21 @@
           <w:rFonts w:ascii="Calibri" w:eastAsia="Times New Roman" w:hAnsi="Calibri" w:cs="Calibri"/>
         </w:rPr>
         <w:lastRenderedPageBreak/>
-        <w:t>Productive data: When user is actively using apps or sites from the allowed list, polled every 10 seconds</w:t>
+        <w:t xml:space="preserve">Productive data: When user is actively using apps or sites from the allowed list, </w:t>
+      </w:r>
+      <w:proofErr w:type="gramStart"/>
+      <w:r>
+        <w:rPr>
+          <w:rFonts w:ascii="Calibri" w:eastAsia="Times New Roman" w:hAnsi="Calibri" w:cs="Calibri"/>
+        </w:rPr>
+        <w:t>polled</w:t>
+      </w:r>
+      <w:proofErr w:type="gramEnd"/>
+      <w:r>
+        <w:rPr>
+          <w:rFonts w:ascii="Calibri" w:eastAsia="Times New Roman" w:hAnsi="Calibri" w:cs="Calibri"/>
+        </w:rPr>
+        <w:t xml:space="preserve"> every 10 seconds</w:t>
       </w:r>
     </w:p>
     <w:p>
@@ -813,7 +1109,21 @@
         <w:rPr>
           <w:rFonts w:ascii="Calibri" w:eastAsia="Times New Roman" w:hAnsi="Calibri" w:cs="Calibri"/>
         </w:rPr>
-        <w:t xml:space="preserve">Unproductive data: When user is actively using apps or sites from the disallowed list, polled every 10 seconds </w:t>
+        <w:t xml:space="preserve">Unproductive data: When user is actively using apps or sites from the disallowed list, </w:t>
+      </w:r>
+      <w:proofErr w:type="gramStart"/>
+      <w:r>
+        <w:rPr>
+          <w:rFonts w:ascii="Calibri" w:eastAsia="Times New Roman" w:hAnsi="Calibri" w:cs="Calibri"/>
+        </w:rPr>
+        <w:t>polled</w:t>
+      </w:r>
+      <w:proofErr w:type="gramEnd"/>
+      <w:r>
+        <w:rPr>
+          <w:rFonts w:ascii="Calibri" w:eastAsia="Times New Roman" w:hAnsi="Calibri" w:cs="Calibri"/>
+        </w:rPr>
+        <w:t xml:space="preserve"> every 10 seconds </w:t>
       </w:r>
     </w:p>
     <w:p>
@@ -831,7 +1141,21 @@
         <w:rPr>
           <w:rFonts w:ascii="Calibri" w:eastAsia="Times New Roman" w:hAnsi="Calibri" w:cs="Calibri"/>
         </w:rPr>
-        <w:t>Not-Sure data: When user is actively using apps or sites not on either list, or when they are on the allowed list but they haven't moved their mouse or pressed a key for 5 minutes. The windows home screen does not count for not-sure data and is not polled.</w:t>
+        <w:t xml:space="preserve">Not-Sure data: When user is actively using apps or sites not on either list, or when they are on the allowed </w:t>
+      </w:r>
+      <w:proofErr w:type="gramStart"/>
+      <w:r>
+        <w:rPr>
+          <w:rFonts w:ascii="Calibri" w:eastAsia="Times New Roman" w:hAnsi="Calibri" w:cs="Calibri"/>
+        </w:rPr>
+        <w:t>list</w:t>
+      </w:r>
+      <w:proofErr w:type="gramEnd"/>
+      <w:r>
+        <w:rPr>
+          <w:rFonts w:ascii="Calibri" w:eastAsia="Times New Roman" w:hAnsi="Calibri" w:cs="Calibri"/>
+        </w:rPr>
+        <w:t xml:space="preserve"> but they haven't moved their mouse or pressed a key for 5 minutes. The windows home screen does not count for not-sure data and is not polled.</w:t>
       </w:r>
     </w:p>
     <w:p>
@@ -885,7 +1209,21 @@
         <w:rPr>
           <w:rFonts w:ascii="Calibri" w:eastAsia="Times New Roman" w:hAnsi="Calibri" w:cs="Calibri"/>
         </w:rPr>
-        <w:t>Consecutive days streak: totals consecutive days, resets to 0 on a skipped day</w:t>
+        <w:t xml:space="preserve">Consecutive days </w:t>
+      </w:r>
+      <w:proofErr w:type="gramStart"/>
+      <w:r>
+        <w:rPr>
+          <w:rFonts w:ascii="Calibri" w:eastAsia="Times New Roman" w:hAnsi="Calibri" w:cs="Calibri"/>
+        </w:rPr>
+        <w:t>streak:</w:t>
+      </w:r>
+      <w:proofErr w:type="gramEnd"/>
+      <w:r>
+        <w:rPr>
+          <w:rFonts w:ascii="Calibri" w:eastAsia="Times New Roman" w:hAnsi="Calibri" w:cs="Calibri"/>
+        </w:rPr>
+        <w:t xml:space="preserve"> totals consecutive days, resets to 0 on a skipped day</w:t>
       </w:r>
     </w:p>
     <w:p>
@@ -903,7 +1241,21 @@
         <w:rPr>
           <w:rFonts w:ascii="Calibri" w:eastAsia="Times New Roman" w:hAnsi="Calibri" w:cs="Calibri"/>
         </w:rPr>
-        <w:t>Total days per month: adds up the total days used each month, saves this for each month for trends</w:t>
+        <w:t xml:space="preserve">Total days per </w:t>
+      </w:r>
+      <w:proofErr w:type="gramStart"/>
+      <w:r>
+        <w:rPr>
+          <w:rFonts w:ascii="Calibri" w:eastAsia="Times New Roman" w:hAnsi="Calibri" w:cs="Calibri"/>
+        </w:rPr>
+        <w:t>month:</w:t>
+      </w:r>
+      <w:proofErr w:type="gramEnd"/>
+      <w:r>
+        <w:rPr>
+          <w:rFonts w:ascii="Calibri" w:eastAsia="Times New Roman" w:hAnsi="Calibri" w:cs="Calibri"/>
+        </w:rPr>
+        <w:t xml:space="preserve"> adds up the total days used each month, saves this for each month for trends</w:t>
       </w:r>
     </w:p>
     <w:p>
@@ -1083,7 +1435,21 @@
         <w:rPr>
           <w:rFonts w:ascii="Calibri" w:eastAsia="Times New Roman" w:hAnsi="Calibri" w:cs="Calibri"/>
         </w:rPr>
-        <w:t>What are a few things that lock you into your work? Music recs (playlists/sets &gt; 1hr long), standing desk, public setting, etc</w:t>
+        <w:t xml:space="preserve">What are a few things that lock you </w:t>
+      </w:r>
+      <w:proofErr w:type="gramStart"/>
+      <w:r>
+        <w:rPr>
+          <w:rFonts w:ascii="Calibri" w:eastAsia="Times New Roman" w:hAnsi="Calibri" w:cs="Calibri"/>
+        </w:rPr>
+        <w:t>into</w:t>
+      </w:r>
+      <w:proofErr w:type="gramEnd"/>
+      <w:r>
+        <w:rPr>
+          <w:rFonts w:ascii="Calibri" w:eastAsia="Times New Roman" w:hAnsi="Calibri" w:cs="Calibri"/>
+        </w:rPr>
+        <w:t xml:space="preserve"> your work? Music recs (playlists/sets &gt; 1hr long), standing desk, public setting, etc</w:t>
       </w:r>
     </w:p>
     <w:p>
@@ -1173,7 +1539,21 @@
         <w:rPr>
           <w:rFonts w:ascii="Calibri" w:eastAsia="Times New Roman" w:hAnsi="Calibri" w:cs="Calibri"/>
         </w:rPr>
-        <w:t>Claude API integration? Enable it to read everything your inbox and populate what your to-do list</w:t>
+        <w:t xml:space="preserve">Claude API integration? Enable it to read </w:t>
+      </w:r>
+      <w:proofErr w:type="gramStart"/>
+      <w:r>
+        <w:rPr>
+          <w:rFonts w:ascii="Calibri" w:eastAsia="Times New Roman" w:hAnsi="Calibri" w:cs="Calibri"/>
+        </w:rPr>
+        <w:t>everything</w:t>
+      </w:r>
+      <w:proofErr w:type="gramEnd"/>
+      <w:r>
+        <w:rPr>
+          <w:rFonts w:ascii="Calibri" w:eastAsia="Times New Roman" w:hAnsi="Calibri" w:cs="Calibri"/>
+        </w:rPr>
+        <w:t xml:space="preserve"> your inbox and populate what your to-do list</w:t>
       </w:r>
     </w:p>
     <w:p>
@@ -1209,7 +1589,21 @@
         <w:rPr>
           <w:rFonts w:ascii="Calibri" w:eastAsia="Times New Roman" w:hAnsi="Calibri" w:cs="Calibri"/>
         </w:rPr>
-        <w:t>Back up claims in prompts with evidence. "studies show that X is effective" + hyperlink</w:t>
+        <w:t>Back up claims in prompts with evidence. "</w:t>
+      </w:r>
+      <w:proofErr w:type="gramStart"/>
+      <w:r>
+        <w:rPr>
+          <w:rFonts w:ascii="Calibri" w:eastAsia="Times New Roman" w:hAnsi="Calibri" w:cs="Calibri"/>
+        </w:rPr>
+        <w:t>studies</w:t>
+      </w:r>
+      <w:proofErr w:type="gramEnd"/>
+      <w:r>
+        <w:rPr>
+          <w:rFonts w:ascii="Calibri" w:eastAsia="Times New Roman" w:hAnsi="Calibri" w:cs="Calibri"/>
+        </w:rPr>
+        <w:t xml:space="preserve"> show that X is effective" + hyperlink</w:t>
       </w:r>
     </w:p>
     <w:p>
@@ -1435,7 +1829,25 @@
             <w:color w:val="0000FF"/>
             <w:u w:val="single"/>
           </w:rPr>
-          <w:t>I deleted every habit app and went back to Apple Reminders. 8 months later I have thoughts. : r/Habits</w:t>
+          <w:t>I deleted every habit app and went back to Apple Reminders. 8 months later I have thoughts</w:t>
+        </w:r>
+        <w:proofErr w:type="gramStart"/>
+        <w:r>
+          <w:rPr>
+            <w:rFonts w:ascii="Calibri" w:eastAsia="Times New Roman" w:hAnsi="Calibri" w:cs="Calibri"/>
+            <w:color w:val="0000FF"/>
+            <w:u w:val="single"/>
+          </w:rPr>
+          <w:t>. :</w:t>
+        </w:r>
+        <w:proofErr w:type="gramEnd"/>
+        <w:r>
+          <w:rPr>
+            <w:rFonts w:ascii="Calibri" w:eastAsia="Times New Roman" w:hAnsi="Calibri" w:cs="Calibri"/>
+            <w:color w:val="0000FF"/>
+            <w:u w:val="single"/>
+          </w:rPr>
+          <w:t xml:space="preserve"> r/Habits</w:t>
         </w:r>
       </w:hyperlink>
     </w:p>

</xml_diff>